<commit_message>
Alinear documentación SICMA con alcance Kanban y capacidad semanal
Actualiza requisitos, casos de uso, modelos, actividades, mockups y gestión. Base: 3 personas × 15 h semanales × 18 semanas = 810 h; 720 h planificadas y 90 h de reserva. Conserva las plantillas y documenta las fechas académicas pendientes.
</commit_message>
<xml_diff>
--- a/Documentación/SICMA_Diagrama_de_Clases_v1.0.docx
+++ b/Documentación/SICMA_Diagrama_de_Clases_v1.0.docx
@@ -296,16 +296,7 @@
           <w:sz w:val="22"/>
           <w:szCs w:val="22"/>
         </w:rPr>
-        <w:t xml:space="preserve">Versión: </w:t>
-      </w:r>
-      <w:r>
-        <w:rPr>
-          <w:rFonts w:ascii="Calibri" w:hAnsi="Calibri" w:cs="Calibri"/>
-          <w:color w:val="202020"/>
-          <w:sz w:val="22"/>
-          <w:szCs w:val="22"/>
-        </w:rPr>
-        <w:t xml:space="preserve">1.0</w:t>
+        <w:t>Versión: 1.0 · revisión de alineación</w:t>
       </w:r>
     </w:p>
     <w:p>
@@ -320,16 +311,7 @@
           <w:sz w:val="22"/>
           <w:szCs w:val="22"/>
         </w:rPr>
-        <w:t xml:space="preserve">Fecha de entrega: </w:t>
-      </w:r>
-      <w:r>
-        <w:rPr>
-          <w:rFonts w:ascii="Calibri" w:hAnsi="Calibri" w:cs="Calibri"/>
-          <w:color w:val="202020"/>
-          <w:sz w:val="22"/>
-          <w:szCs w:val="22"/>
-        </w:rPr>
-        <w:t xml:space="preserve">septiembre de 2026</w:t>
+        <w:t>Actualización: 5 de octubre de 2026</w:t>
       </w:r>
     </w:p>
     <w:p>
@@ -375,11 +357,147 @@
       </w:r>
     </w:p>
     <w:p>
+      <w:pPr>
+        <w:keepNext w:val="0"/>
+        <w:pageBreakBefore w:val="0"/>
+        <w:tabs>
+          <w:tab w:pos="8928" w:val="right" w:leader="dot"/>
+        </w:tabs>
+        <w:spacing w:after="100"/>
+      </w:pPr>
       <w:r>
         <w:fldChar w:fldCharType="begin"/>
-        <w:instrText xml:space="preserve"> TOC \o "1-3" \h \z \u </w:instrText>
+      </w:r>
+      <w:r>
+        <w:instrText> TOC \o "1-1" \h \z \u </w:instrText>
+      </w:r>
+      <w:r>
         <w:fldChar w:fldCharType="separate"/>
-        <w:t>Actualiza este campo en Word para generar el índice.</w:t>
+      </w:r>
+      <w:r>
+        <w:rPr>
+          <w:b w:val="0"/>
+          <w:sz w:val="20"/>
+        </w:rPr>
+        <w:t>1. Propósito y alcance</w:t>
+        <w:tab/>
+        <w:t>3</w:t>
+      </w:r>
+    </w:p>
+    <w:p>
+      <w:pPr>
+        <w:keepNext w:val="0"/>
+        <w:pageBreakBefore w:val="0"/>
+        <w:tabs>
+          <w:tab w:pos="8928" w:val="right" w:leader="dot"/>
+        </w:tabs>
+        <w:spacing w:after="100"/>
+      </w:pPr>
+      <w:r>
+        <w:rPr>
+          <w:b w:val="0"/>
+          <w:sz w:val="20"/>
+        </w:rPr>
+        <w:t>2. Diccionario de clases</w:t>
+        <w:tab/>
+        <w:t>3</w:t>
+      </w:r>
+    </w:p>
+    <w:p>
+      <w:pPr>
+        <w:keepNext w:val="0"/>
+        <w:pageBreakBefore w:val="0"/>
+        <w:tabs>
+          <w:tab w:pos="8928" w:val="right" w:leader="dot"/>
+        </w:tabs>
+        <w:spacing w:after="100"/>
+      </w:pPr>
+      <w:r>
+        <w:rPr>
+          <w:b w:val="0"/>
+          <w:sz w:val="20"/>
+        </w:rPr>
+        <w:t>3. Relaciones principales del modelo</w:t>
+        <w:tab/>
+        <w:t>4</w:t>
+      </w:r>
+    </w:p>
+    <w:p>
+      <w:pPr>
+        <w:keepNext w:val="0"/>
+        <w:pageBreakBefore w:val="0"/>
+        <w:tabs>
+          <w:tab w:pos="8928" w:val="right" w:leader="dot"/>
+        </w:tabs>
+        <w:spacing w:after="100"/>
+      </w:pPr>
+      <w:r>
+        <w:rPr>
+          <w:b w:val="0"/>
+          <w:sz w:val="20"/>
+        </w:rPr>
+        <w:t>4. Reglas de negocio reflejadas en el diagrama</w:t>
+        <w:tab/>
+        <w:t>4</w:t>
+      </w:r>
+    </w:p>
+    <w:p>
+      <w:pPr>
+        <w:keepNext w:val="0"/>
+        <w:pageBreakBefore w:val="0"/>
+        <w:tabs>
+          <w:tab w:pos="8928" w:val="right" w:leader="dot"/>
+        </w:tabs>
+        <w:spacing w:after="100"/>
+      </w:pPr>
+      <w:r>
+        <w:rPr>
+          <w:b w:val="0"/>
+          <w:sz w:val="20"/>
+        </w:rPr>
+        <w:t>5. Validación de consistencia con el modelo relacional</w:t>
+        <w:tab/>
+        <w:t>5</w:t>
+      </w:r>
+    </w:p>
+    <w:p>
+      <w:pPr>
+        <w:keepNext w:val="0"/>
+        <w:pageBreakBefore w:val="0"/>
+        <w:tabs>
+          <w:tab w:pos="8928" w:val="right" w:leader="dot"/>
+        </w:tabs>
+        <w:spacing w:after="100"/>
+      </w:pPr>
+      <w:r>
+        <w:rPr>
+          <w:b w:val="0"/>
+          <w:sz w:val="20"/>
+        </w:rPr>
+        <w:t>Referencias</w:t>
+        <w:tab/>
+        <w:t>6</w:t>
+      </w:r>
+    </w:p>
+    <w:p>
+      <w:pPr>
+        <w:keepNext w:val="0"/>
+        <w:pageBreakBefore w:val="0"/>
+        <w:tabs>
+          <w:tab w:pos="8928" w:val="right" w:leader="dot"/>
+        </w:tabs>
+        <w:spacing w:after="100"/>
+      </w:pPr>
+      <w:r>
+        <w:rPr>
+          <w:b w:val="0"/>
+          <w:sz w:val="20"/>
+        </w:rPr>
+        <w:t>Anexo A. Diagrama de clases UML</w:t>
+        <w:tab/>
+        <w:t>7</w:t>
+      </w:r>
+      <w:r>
         <w:fldChar w:fldCharType="end"/>
       </w:r>
     </w:p>
@@ -402,7 +520,7 @@
         <w:jc w:val="both"/>
       </w:pPr>
       <w:r>
-        <w:t>Este documento acompaña al diagrama de clases UML del modelo de datos de SICMA y valida su consistencia con el modelo relacional que se implementará sobre MySQL 8.x en topología InnoDB Cluster. El diagrama emplea notación UML estándar: clases con tres secciones (nombre, atributos y métodos —omitidos por tratarse de un modelo de datos—), tipo de dato junto a cada atributo, clave primaria subrayada, y multiplicidad en ambos extremos de cada asociación.</w:t>
+        <w:t>Modelo conceptual de datos ajustado a los 31 RF vigentes. Las cajas representan entidades y atributos relevantes; las relaciones indican cardinalidad. No certifica que el esquema o clúster estén implementados.</w:t>
       </w:r>
     </w:p>
     <w:p>
@@ -411,7 +529,7 @@
         <w:jc w:val="both"/>
       </w:pPr>
       <w:r>
-        <w:t>El alcance corresponde exclusivamente a las entidades de negocio de SICMA. No se incluyen clases de auditoría general, respaldo, configuración de parámetros generales ni ningún elemento relacionado con identificación por código QR, por encontrarse fuera del alcance del proyecto.</w:t>
+        <w:t>Quedan fuera reservas propias y resolución de solapamientos, permisos físicos administrados en SICMA, salud general de dependencias, adjuntos, exportaciones generales y un dashboard analítico web que duplique Power BI. Se mantienen las exclusiones de QR, auditoría general, respaldo lógico, biometría cruda y actuación física.</w:t>
       </w:r>
     </w:p>
     <w:p>
@@ -605,7 +723,7 @@
                 <w:szCs w:val="18"/>
                 <w:color w:val="202020"/>
               </w:rPr>
-              <w:t>Cuenta de operador con rol y estado; actor de las acciones trazables (historial, evidencias, intervenciones, bitácoras).</w:t>
+              <w:t>Cuenta de aplicación; sesión y recuperación gestionadas por Django.</w:t>
             </w:r>
           </w:p>
         </w:tc>
@@ -632,7 +750,6 @@
               <w:bottom w:w="55" w:type="dxa"/>
               <w:right w:w="110" w:type="dxa"/>
             </w:tcMar>
-            <w:shd w:val="clear" w:color="auto" w:fill="F7F9FC"/>
             <w:vAlign w:val="center"/>
           </w:tcPr>
           <w:p>
@@ -648,7 +765,7 @@
                 <w:szCs w:val="18"/>
                 <w:color w:val="202020"/>
               </w:rPr>
-              <w:t>Activo</w:t>
+              <w:t>Ubicacion</w:t>
             </w:r>
           </w:p>
         </w:tc>
@@ -667,21 +784,20 @@
               <w:bottom w:w="55" w:type="dxa"/>
               <w:right w:w="110" w:type="dxa"/>
             </w:tcMar>
-            <w:shd w:val="clear" w:color="auto" w:fill="F7F9FC"/>
-            <w:vAlign w:val="center"/>
-          </w:tcPr>
-          <w:p>
-            <w:pPr>
-              <w:spacing w:before="40" w:after="40" w:line="240" w:lineRule="auto"/>
-              <w:jc w:val="left"/>
-            </w:pPr>
-            <w:r>
-              <w:rPr>
-                <w:sz w:val="18"/>
-                <w:szCs w:val="18"/>
-                <w:color w:val="202020"/>
-              </w:rPr>
-              <w:t>Elemento de infraestructura del datacenter bajo inventario, con estado operativo y criticidad.</w:t>
+            <w:vAlign w:val="center"/>
+          </w:tcPr>
+          <w:p>
+            <w:pPr>
+              <w:spacing w:before="40" w:after="40" w:line="240" w:lineRule="auto"/>
+              <w:jc w:val="left"/>
+            </w:pPr>
+            <w:r>
+              <w:rPr>
+                <w:sz w:val="18"/>
+                <w:szCs w:val="18"/>
+                <w:color w:val="202020"/>
+              </w:rPr>
+              <w:t>Clasificación de activos y sensores.</w:t>
             </w:r>
           </w:p>
         </w:tc>
@@ -723,7 +839,7 @@
                 <w:szCs w:val="18"/>
                 <w:color w:val="202020"/>
               </w:rPr>
-              <w:t>Ubicacion</w:t>
+              <w:t>Activo</w:t>
             </w:r>
           </w:p>
         </w:tc>
@@ -755,7 +871,7 @@
                 <w:szCs w:val="18"/>
                 <w:color w:val="202020"/>
               </w:rPr>
-              <w:t>Ubicación física jerárquica (sala → zona → rack → posición) que aloja activos, sensores y puntos de acceso.</w:t>
+              <w:t>Inventario y retiro lógico.</w:t>
             </w:r>
           </w:p>
         </w:tc>
@@ -782,7 +898,6 @@
               <w:bottom w:w="55" w:type="dxa"/>
               <w:right w:w="110" w:type="dxa"/>
             </w:tcMar>
-            <w:shd w:val="clear" w:color="auto" w:fill="F7F9FC"/>
             <w:vAlign w:val="center"/>
           </w:tcPr>
           <w:p>
@@ -817,21 +932,20 @@
               <w:bottom w:w="55" w:type="dxa"/>
               <w:right w:w="110" w:type="dxa"/>
             </w:tcMar>
-            <w:shd w:val="clear" w:color="auto" w:fill="F7F9FC"/>
-            <w:vAlign w:val="center"/>
-          </w:tcPr>
-          <w:p>
-            <w:pPr>
-              <w:spacing w:before="40" w:after="40" w:line="240" w:lineRule="auto"/>
-              <w:jc w:val="left"/>
-            </w:pPr>
-            <w:r>
-              <w:rPr>
-                <w:sz w:val="18"/>
-                <w:szCs w:val="18"/>
-                <w:color w:val="202020"/>
-              </w:rPr>
-              <w:t>Registro inmutable de cambios de atributos de un activo (qué, valor anterior/nuevo, quién y cuándo).</w:t>
+            <w:vAlign w:val="center"/>
+          </w:tcPr>
+          <w:p>
+            <w:pPr>
+              <w:spacing w:before="40" w:after="40" w:line="240" w:lineRule="auto"/>
+              <w:jc w:val="left"/>
+            </w:pPr>
+            <w:r>
+              <w:rPr>
+                <w:sz w:val="18"/>
+                <w:szCs w:val="18"/>
+                <w:color w:val="202020"/>
+              </w:rPr>
+              <w:t>Cambios específicos del activo; solo inserción.</w:t>
             </w:r>
           </w:p>
         </w:tc>
@@ -873,7 +987,7 @@
                 <w:szCs w:val="18"/>
                 <w:color w:val="202020"/>
               </w:rPr>
-              <w:t>ArchivoAdjunto</w:t>
+              <w:t>Sensor</w:t>
             </w:r>
           </w:p>
         </w:tc>
@@ -905,7 +1019,7 @@
                 <w:szCs w:val="18"/>
                 <w:color w:val="202020"/>
               </w:rPr>
-              <w:t>Documento o imagen (PDF/PNG/JPG) asociado a un activo, con su metadato de carga.</w:t>
+              <w:t>Identidad y ubicación de dispositivo.</w:t>
             </w:r>
           </w:p>
         </w:tc>
@@ -932,7 +1046,6 @@
               <w:bottom w:w="55" w:type="dxa"/>
               <w:right w:w="110" w:type="dxa"/>
             </w:tcMar>
-            <w:shd w:val="clear" w:color="auto" w:fill="F7F9FC"/>
             <w:vAlign w:val="center"/>
           </w:tcPr>
           <w:p>
@@ -948,7 +1061,7 @@
                 <w:szCs w:val="18"/>
                 <w:color w:val="202020"/>
               </w:rPr>
-              <w:t>Sensor</w:t>
+              <w:t>Medicion</w:t>
             </w:r>
           </w:p>
         </w:tc>
@@ -967,21 +1080,20 @@
               <w:bottom w:w="55" w:type="dxa"/>
               <w:right w:w="110" w:type="dxa"/>
             </w:tcMar>
-            <w:shd w:val="clear" w:color="auto" w:fill="F7F9FC"/>
-            <w:vAlign w:val="center"/>
-          </w:tcPr>
-          <w:p>
-            <w:pPr>
-              <w:spacing w:before="40" w:after="40" w:line="240" w:lineRule="auto"/>
-              <w:jc w:val="left"/>
-            </w:pPr>
-            <w:r>
-              <w:rPr>
-                <w:sz w:val="18"/>
-                <w:szCs w:val="18"/>
-                <w:color w:val="202020"/>
-              </w:rPr>
-              <w:t>Dispositivo IoT que mide variables ambientales en una ubicación, con intervalo esperado de reporte.</w:t>
+            <w:vAlign w:val="center"/>
+          </w:tcPr>
+          <w:p>
+            <w:pPr>
+              <w:spacing w:before="40" w:after="40" w:line="240" w:lineRule="auto"/>
+              <w:jc w:val="left"/>
+            </w:pPr>
+            <w:r>
+              <w:rPr>
+                <w:sz w:val="18"/>
+                <w:szCs w:val="18"/>
+                <w:color w:val="202020"/>
+              </w:rPr>
+              <w:t>Recepción y origen; UNIQUE(sensor_id, evento_id).</w:t>
             </w:r>
           </w:p>
         </w:tc>
@@ -1023,7 +1135,7 @@
                 <w:szCs w:val="18"/>
                 <w:color w:val="202020"/>
               </w:rPr>
-              <w:t>Medicion</w:t>
+              <w:t>UmbralAmbiental</w:t>
             </w:r>
           </w:p>
         </w:tc>
@@ -1055,7 +1167,7 @@
                 <w:szCs w:val="18"/>
                 <w:color w:val="202020"/>
               </w:rPr>
-              <w:t>Lectura ambiental inmutable (temperatura/humedad) capturada por un sensor, real o simulada.</w:t>
+              <w:t>Regla ambiental; exactamente una zona o dispositivo como alcance.</w:t>
             </w:r>
           </w:p>
         </w:tc>
@@ -1082,7 +1194,6 @@
               <w:bottom w:w="55" w:type="dxa"/>
               <w:right w:w="110" w:type="dxa"/>
             </w:tcMar>
-            <w:shd w:val="clear" w:color="auto" w:fill="F7F9FC"/>
             <w:vAlign w:val="center"/>
           </w:tcPr>
           <w:p>
@@ -1098,7 +1209,7 @@
                 <w:szCs w:val="18"/>
                 <w:color w:val="202020"/>
               </w:rPr>
-              <w:t>UmbralAmbiental</w:t>
+              <w:t>Alerta</w:t>
             </w:r>
           </w:p>
         </w:tc>
@@ -1117,21 +1228,20 @@
               <w:bottom w:w="55" w:type="dxa"/>
               <w:right w:w="110" w:type="dxa"/>
             </w:tcMar>
-            <w:shd w:val="clear" w:color="auto" w:fill="F7F9FC"/>
-            <w:vAlign w:val="center"/>
-          </w:tcPr>
-          <w:p>
-            <w:pPr>
-              <w:spacing w:before="40" w:after="40" w:line="240" w:lineRule="auto"/>
-              <w:jc w:val="left"/>
-            </w:pPr>
-            <w:r>
-              <w:rPr>
-                <w:sz w:val="18"/>
-                <w:szCs w:val="18"/>
-                <w:color w:val="202020"/>
-              </w:rPr>
-              <w:t>Rango mínimo/máximo versionado por ubicación y variable para evaluar las mediciones.</w:t>
+            <w:vAlign w:val="center"/>
+          </w:tcPr>
+          <w:p>
+            <w:pPr>
+              <w:spacing w:before="40" w:after="40" w:line="240" w:lineRule="auto"/>
+              <w:jc w:val="left"/>
+            </w:pPr>
+            <w:r>
+              <w:rPr>
+                <w:sz w:val="18"/>
+                <w:szCs w:val="18"/>
+                <w:color w:val="202020"/>
+              </w:rPr>
+              <w:t>Anomalía ambiental o de rendimiento; sin flujo manual de atención.</w:t>
             </w:r>
           </w:p>
         </w:tc>
@@ -1173,7 +1283,7 @@
                 <w:szCs w:val="18"/>
                 <w:color w:val="202020"/>
               </w:rPr>
-              <w:t>Alerta</w:t>
+              <w:t>Notificacion</w:t>
             </w:r>
           </w:p>
         </w:tc>
@@ -1205,7 +1315,7 @@
                 <w:szCs w:val="18"/>
                 <w:color w:val="202020"/>
               </w:rPr>
-              <w:t>Evento de anomalía originado en IoT, biometría o Zabbix, con severidad y ciclo de vida propio.</w:t>
+              <w:t>Evidencia de envío sin contraseñas ni tokens.</w:t>
             </w:r>
           </w:p>
         </w:tc>
@@ -1232,7 +1342,6 @@
               <w:bottom w:w="55" w:type="dxa"/>
               <w:right w:w="110" w:type="dxa"/>
             </w:tcMar>
-            <w:shd w:val="clear" w:color="auto" w:fill="F7F9FC"/>
             <w:vAlign w:val="center"/>
           </w:tcPr>
           <w:p>
@@ -1248,7 +1357,7 @@
                 <w:szCs w:val="18"/>
                 <w:color w:val="202020"/>
               </w:rPr>
-              <w:t>EvidenciaAlerta</w:t>
+              <w:t>PuntoAcceso</w:t>
             </w:r>
           </w:p>
         </w:tc>
@@ -1267,21 +1376,20 @@
               <w:bottom w:w="55" w:type="dxa"/>
               <w:right w:w="110" w:type="dxa"/>
             </w:tcMar>
-            <w:shd w:val="clear" w:color="auto" w:fill="F7F9FC"/>
-            <w:vAlign w:val="center"/>
-          </w:tcPr>
-          <w:p>
-            <w:pPr>
-              <w:spacing w:before="40" w:after="40" w:line="240" w:lineRule="auto"/>
-              <w:jc w:val="left"/>
-            </w:pPr>
-            <w:r>
-              <w:rPr>
-                <w:sz w:val="18"/>
-                <w:szCs w:val="18"/>
-                <w:color w:val="202020"/>
-              </w:rPr>
-              <w:t>Causa, acción ejecutada y resultado de la gestión de una alerta por parte de un usuario.</w:t>
+            <w:vAlign w:val="center"/>
+          </w:tcPr>
+          <w:p>
+            <w:pPr>
+              <w:spacing w:before="40" w:after="40" w:line="240" w:lineRule="auto"/>
+              <w:jc w:val="left"/>
+            </w:pPr>
+            <w:r>
+              <w:rPr>
+                <w:sz w:val="18"/>
+                <w:szCs w:val="18"/>
+                <w:color w:val="202020"/>
+              </w:rPr>
+              <w:t>Identifica el origen del evento HID.</w:t>
             </w:r>
           </w:p>
         </w:tc>
@@ -1323,7 +1431,7 @@
                 <w:szCs w:val="18"/>
                 <w:color w:val="202020"/>
               </w:rPr>
-              <w:t>ReglaAlerta</w:t>
+              <w:t>EventoAcceso</w:t>
             </w:r>
           </w:p>
         </w:tc>
@@ -1355,7 +1463,7 @@
                 <w:szCs w:val="18"/>
                 <w:color w:val="202020"/>
               </w:rPr>
-              <w:t>Definición versionada de condición, severidad y destinatarios para generar y enrutar alertas.</w:t>
+              <w:t>Intento permitido/denegado recibido de HID; inalterable.</w:t>
             </w:r>
           </w:p>
         </w:tc>
@@ -1382,7 +1490,6 @@
               <w:bottom w:w="55" w:type="dxa"/>
               <w:right w:w="110" w:type="dxa"/>
             </w:tcMar>
-            <w:shd w:val="clear" w:color="auto" w:fill="F7F9FC"/>
             <w:vAlign w:val="center"/>
           </w:tcPr>
           <w:p>
@@ -1398,7 +1505,7 @@
                 <w:szCs w:val="18"/>
                 <w:color w:val="202020"/>
               </w:rPr>
-              <w:t>Notificacion</w:t>
+              <w:t>Intervencion</w:t>
             </w:r>
           </w:p>
         </w:tc>
@@ -1417,21 +1524,20 @@
               <w:bottom w:w="55" w:type="dxa"/>
               <w:right w:w="110" w:type="dxa"/>
             </w:tcMar>
-            <w:shd w:val="clear" w:color="auto" w:fill="F7F9FC"/>
-            <w:vAlign w:val="center"/>
-          </w:tcPr>
-          <w:p>
-            <w:pPr>
-              <w:spacing w:before="40" w:after="40" w:line="240" w:lineRule="auto"/>
-              <w:jc w:val="left"/>
-            </w:pPr>
-            <w:r>
-              <w:rPr>
-                <w:sz w:val="18"/>
-                <w:szCs w:val="18"/>
-                <w:color w:val="202020"/>
-              </w:rPr>
-              <w:t>Envío de un mensaje (SMTP o Power Automate) derivado de una alerta o de una intervención.</w:t>
+            <w:vAlign w:val="center"/>
+          </w:tcPr>
+          <w:p>
+            <w:pPr>
+              <w:spacing w:before="40" w:after="40" w:line="240" w:lineRule="auto"/>
+              <w:jc w:val="left"/>
+            </w:pPr>
+            <w:r>
+              <w:rPr>
+                <w:sz w:val="18"/>
+                <w:szCs w:val="18"/>
+                <w:color w:val="202020"/>
+              </w:rPr>
+              <w:t>Solicitud y agenda externa; no reserva recursos.</w:t>
             </w:r>
           </w:p>
         </w:tc>
@@ -1473,7 +1579,7 @@
                 <w:szCs w:val="18"/>
                 <w:color w:val="202020"/>
               </w:rPr>
-              <w:t>PersonaAutorizada</w:t>
+              <w:t>IntervencionActivo</w:t>
             </w:r>
           </w:p>
         </w:tc>
@@ -1505,7 +1611,7 @@
                 <w:szCs w:val="18"/>
                 <w:color w:val="202020"/>
               </w:rPr>
-              <w:t>Persona con acceso físico, identificada solo por un identificador biométrico externo (sin datos biométricos crudos).</w:t>
+              <w:t>Relación N:M; par único.</w:t>
             </w:r>
           </w:p>
         </w:tc>
@@ -1532,7 +1638,6 @@
               <w:bottom w:w="55" w:type="dxa"/>
               <w:right w:w="110" w:type="dxa"/>
             </w:tcMar>
-            <w:shd w:val="clear" w:color="auto" w:fill="F7F9FC"/>
             <w:vAlign w:val="center"/>
           </w:tcPr>
           <w:p>
@@ -1548,7 +1653,7 @@
                 <w:szCs w:val="18"/>
                 <w:color w:val="202020"/>
               </w:rPr>
-              <w:t>PuntoAcceso</w:t>
+              <w:t>HistorialIntervencion</w:t>
             </w:r>
           </w:p>
         </w:tc>
@@ -1567,21 +1672,20 @@
               <w:bottom w:w="55" w:type="dxa"/>
               <w:right w:w="110" w:type="dxa"/>
             </w:tcMar>
-            <w:shd w:val="clear" w:color="auto" w:fill="F7F9FC"/>
-            <w:vAlign w:val="center"/>
-          </w:tcPr>
-          <w:p>
-            <w:pPr>
-              <w:spacing w:before="40" w:after="40" w:line="240" w:lineRule="auto"/>
-              <w:jc w:val="left"/>
-            </w:pPr>
-            <w:r>
-              <w:rPr>
-                <w:sz w:val="18"/>
-                <w:szCs w:val="18"/>
-                <w:color w:val="202020"/>
-              </w:rPr>
-              <w:t>Punto de control de acceso físico situado en una ubicación.</w:t>
+            <w:vAlign w:val="center"/>
+          </w:tcPr>
+          <w:p>
+            <w:pPr>
+              <w:spacing w:before="40" w:after="40" w:line="240" w:lineRule="auto"/>
+              <w:jc w:val="left"/>
+            </w:pPr>
+            <w:r>
+              <w:rPr>
+                <w:sz w:val="18"/>
+                <w:szCs w:val="18"/>
+                <w:color w:val="202020"/>
+              </w:rPr>
+              <w:t>Decisión, inicio, avance y cierre con resultado.</w:t>
             </w:r>
           </w:p>
         </w:tc>
@@ -1623,7 +1727,7 @@
                 <w:szCs w:val="18"/>
                 <w:color w:val="202020"/>
               </w:rPr>
-              <w:t>PermisoAcceso</w:t>
+              <w:t>HostZabbix</w:t>
             </w:r>
           </w:p>
         </w:tc>
@@ -1655,7 +1759,7 @@
                 <w:szCs w:val="18"/>
                 <w:color w:val="202020"/>
               </w:rPr>
-              <w:t>Autorización de una persona sobre un punto de acceso, con vigencia y estado.</w:t>
+              <w:t>Vínculo con servidor y última observación.</w:t>
             </w:r>
           </w:p>
         </w:tc>
@@ -1682,7 +1786,6 @@
               <w:bottom w:w="55" w:type="dxa"/>
               <w:right w:w="110" w:type="dxa"/>
             </w:tcMar>
-            <w:shd w:val="clear" w:color="auto" w:fill="F7F9FC"/>
             <w:vAlign w:val="center"/>
           </w:tcPr>
           <w:p>
@@ -1698,7 +1801,7 @@
                 <w:szCs w:val="18"/>
                 <w:color w:val="202020"/>
               </w:rPr>
-              <w:t>PermisoDia</w:t>
+              <w:t>EventoZabbix</w:t>
             </w:r>
           </w:p>
         </w:tc>
@@ -1717,21 +1820,20 @@
               <w:bottom w:w="55" w:type="dxa"/>
               <w:right w:w="110" w:type="dxa"/>
             </w:tcMar>
-            <w:shd w:val="clear" w:color="auto" w:fill="F7F9FC"/>
-            <w:vAlign w:val="center"/>
-          </w:tcPr>
-          <w:p>
-            <w:pPr>
-              <w:spacing w:before="40" w:after="40" w:line="240" w:lineRule="auto"/>
-              <w:jc w:val="left"/>
-            </w:pPr>
-            <w:r>
-              <w:rPr>
-                <w:sz w:val="18"/>
-                <w:szCs w:val="18"/>
-                <w:color w:val="202020"/>
-              </w:rPr>
-              <w:t>Ventana horaria por día que compone un permiso de acceso; no existe sin su permiso (composición).</w:t>
+            <w:vAlign w:val="center"/>
+          </w:tcPr>
+          <w:p>
+            <w:pPr>
+              <w:spacing w:before="40" w:after="40" w:line="240" w:lineRule="auto"/>
+              <w:jc w:val="left"/>
+            </w:pPr>
+            <w:r>
+              <w:rPr>
+                <w:sz w:val="18"/>
+                <w:szCs w:val="18"/>
+                <w:color w:val="202020"/>
+              </w:rPr>
+              <w:t>Problema o evento técnico de infraestructura.</w:t>
             </w:r>
           </w:p>
         </w:tc>
@@ -1773,7 +1875,7 @@
                 <w:szCs w:val="18"/>
                 <w:color w:val="202020"/>
               </w:rPr>
-              <w:t>EventoAcceso</w:t>
+              <w:t>EventoTecnicoIngesta</w:t>
             </w:r>
           </w:p>
         </w:tc>
@@ -1805,681 +1907,7 @@
                 <w:szCs w:val="18"/>
                 <w:color w:val="202020"/>
               </w:rPr>
-              <w:t>Registro inmutable de un intento de acceso físico y su resultado (permitido/denegado/error).</w:t>
-            </w:r>
-          </w:p>
-        </w:tc>
-      </w:tr>
-      <w:tr>
-        <w:tblPrEx>
-          <w:tblCellMar>
-            <w:top w:w="0" w:type="dxa"/>
-            <w:bottom w:w="0" w:type="dxa"/>
-          </w:tblCellMar>
-        </w:tblPrEx>
-        <w:tc>
-          <w:tcPr>
-            <w:tcW w:w="2600" w:type="dxa"/>
-            <w:tcBorders>
-              <w:top w:val="single" w:sz="1" w:space="0" w:color="CCCCCC"/>
-              <w:left w:val="single" w:sz="1" w:space="0" w:color="CCCCCC"/>
-              <w:bottom w:val="single" w:sz="1" w:space="0" w:color="CCCCCC"/>
-              <w:right w:val="single" w:sz="1" w:space="0" w:color="CCCCCC"/>
-            </w:tcBorders>
-            <w:tcMar>
-              <w:top w:w="55" w:type="dxa"/>
-              <w:left w:w="110" w:type="dxa"/>
-              <w:bottom w:w="55" w:type="dxa"/>
-              <w:right w:w="110" w:type="dxa"/>
-            </w:tcMar>
-            <w:shd w:val="clear" w:color="auto" w:fill="F7F9FC"/>
-            <w:vAlign w:val="center"/>
-          </w:tcPr>
-          <w:p>
-            <w:pPr>
-              <w:spacing w:before="40" w:after="40" w:line="240" w:lineRule="auto"/>
-              <w:jc w:val="left"/>
-            </w:pPr>
-            <w:r>
-              <w:rPr>
-                <w:b/>
-                <w:bCs/>
-                <w:sz w:val="18"/>
-                <w:szCs w:val="18"/>
-                <w:color w:val="202020"/>
-              </w:rPr>
-              <w:t>Intervencion</w:t>
-            </w:r>
-          </w:p>
-        </w:tc>
-        <w:tc>
-          <w:tcPr>
-            <w:tcW w:w="6760" w:type="dxa"/>
-            <w:tcBorders>
-              <w:top w:val="single" w:sz="1" w:space="0" w:color="CCCCCC"/>
-              <w:left w:val="single" w:sz="1" w:space="0" w:color="CCCCCC"/>
-              <w:bottom w:val="single" w:sz="1" w:space="0" w:color="CCCCCC"/>
-              <w:right w:val="single" w:sz="1" w:space="0" w:color="CCCCCC"/>
-            </w:tcBorders>
-            <w:tcMar>
-              <w:top w:w="55" w:type="dxa"/>
-              <w:left w:w="110" w:type="dxa"/>
-              <w:bottom w:w="55" w:type="dxa"/>
-              <w:right w:w="110" w:type="dxa"/>
-            </w:tcMar>
-            <w:shd w:val="clear" w:color="auto" w:fill="F7F9FC"/>
-            <w:vAlign w:val="center"/>
-          </w:tcPr>
-          <w:p>
-            <w:pPr>
-              <w:spacing w:before="40" w:after="40" w:line="240" w:lineRule="auto"/>
-              <w:jc w:val="left"/>
-            </w:pPr>
-            <w:r>
-              <w:rPr>
-                <w:sz w:val="18"/>
-                <w:szCs w:val="18"/>
-                <w:color w:val="202020"/>
-              </w:rPr>
-              <w:t>Cambio planificado sobre activos, con flujo de aprobación, ejecución y plan de reversa.</w:t>
-            </w:r>
-          </w:p>
-        </w:tc>
-      </w:tr>
-      <w:tr>
-        <w:tblPrEx>
-          <w:tblCellMar>
-            <w:top w:w="0" w:type="dxa"/>
-            <w:bottom w:w="0" w:type="dxa"/>
-          </w:tblCellMar>
-        </w:tblPrEx>
-        <w:tc>
-          <w:tcPr>
-            <w:tcW w:w="2600" w:type="dxa"/>
-            <w:tcBorders>
-              <w:top w:val="single" w:sz="1" w:space="0" w:color="CCCCCC"/>
-              <w:left w:val="single" w:sz="1" w:space="0" w:color="CCCCCC"/>
-              <w:bottom w:val="single" w:sz="1" w:space="0" w:color="CCCCCC"/>
-              <w:right w:val="single" w:sz="1" w:space="0" w:color="CCCCCC"/>
-            </w:tcBorders>
-            <w:tcMar>
-              <w:top w:w="55" w:type="dxa"/>
-              <w:left w:w="110" w:type="dxa"/>
-              <w:bottom w:w="55" w:type="dxa"/>
-              <w:right w:w="110" w:type="dxa"/>
-            </w:tcMar>
-            <w:vAlign w:val="center"/>
-          </w:tcPr>
-          <w:p>
-            <w:pPr>
-              <w:spacing w:before="40" w:after="40" w:line="240" w:lineRule="auto"/>
-              <w:jc w:val="left"/>
-            </w:pPr>
-            <w:r>
-              <w:rPr>
-                <w:b/>
-                <w:bCs/>
-                <w:sz w:val="18"/>
-                <w:szCs w:val="18"/>
-                <w:color w:val="202020"/>
-              </w:rPr>
-              <w:t>IntervencionActivo</w:t>
-            </w:r>
-          </w:p>
-        </w:tc>
-        <w:tc>
-          <w:tcPr>
-            <w:tcW w:w="6760" w:type="dxa"/>
-            <w:tcBorders>
-              <w:top w:val="single" w:sz="1" w:space="0" w:color="CCCCCC"/>
-              <w:left w:val="single" w:sz="1" w:space="0" w:color="CCCCCC"/>
-              <w:bottom w:val="single" w:sz="1" w:space="0" w:color="CCCCCC"/>
-              <w:right w:val="single" w:sz="1" w:space="0" w:color="CCCCCC"/>
-            </w:tcBorders>
-            <w:tcMar>
-              <w:top w:w="55" w:type="dxa"/>
-              <w:left w:w="110" w:type="dxa"/>
-              <w:bottom w:w="55" w:type="dxa"/>
-              <w:right w:w="110" w:type="dxa"/>
-            </w:tcMar>
-            <w:vAlign w:val="center"/>
-          </w:tcPr>
-          <w:p>
-            <w:pPr>
-              <w:spacing w:before="40" w:after="40" w:line="240" w:lineRule="auto"/>
-              <w:jc w:val="left"/>
-            </w:pPr>
-            <w:r>
-              <w:rPr>
-                <w:sz w:val="18"/>
-                <w:szCs w:val="18"/>
-                <w:color w:val="202020"/>
-              </w:rPr>
-              <w:t>Vínculo entre una intervención y cada activo afectado; base del control de solapamientos.</w:t>
-            </w:r>
-          </w:p>
-        </w:tc>
-      </w:tr>
-      <w:tr>
-        <w:tblPrEx>
-          <w:tblCellMar>
-            <w:top w:w="0" w:type="dxa"/>
-            <w:bottom w:w="0" w:type="dxa"/>
-          </w:tblCellMar>
-        </w:tblPrEx>
-        <w:tc>
-          <w:tcPr>
-            <w:tcW w:w="2600" w:type="dxa"/>
-            <w:tcBorders>
-              <w:top w:val="single" w:sz="1" w:space="0" w:color="CCCCCC"/>
-              <w:left w:val="single" w:sz="1" w:space="0" w:color="CCCCCC"/>
-              <w:bottom w:val="single" w:sz="1" w:space="0" w:color="CCCCCC"/>
-              <w:right w:val="single" w:sz="1" w:space="0" w:color="CCCCCC"/>
-            </w:tcBorders>
-            <w:tcMar>
-              <w:top w:w="55" w:type="dxa"/>
-              <w:left w:w="110" w:type="dxa"/>
-              <w:bottom w:w="55" w:type="dxa"/>
-              <w:right w:w="110" w:type="dxa"/>
-            </w:tcMar>
-            <w:shd w:val="clear" w:color="auto" w:fill="F7F9FC"/>
-            <w:vAlign w:val="center"/>
-          </w:tcPr>
-          <w:p>
-            <w:pPr>
-              <w:spacing w:before="40" w:after="40" w:line="240" w:lineRule="auto"/>
-              <w:jc w:val="left"/>
-            </w:pPr>
-            <w:r>
-              <w:rPr>
-                <w:b/>
-                <w:bCs/>
-                <w:sz w:val="18"/>
-                <w:szCs w:val="18"/>
-                <w:color w:val="202020"/>
-              </w:rPr>
-              <w:t>DecisionIntervencion</w:t>
-            </w:r>
-          </w:p>
-        </w:tc>
-        <w:tc>
-          <w:tcPr>
-            <w:tcW w:w="6760" w:type="dxa"/>
-            <w:tcBorders>
-              <w:top w:val="single" w:sz="1" w:space="0" w:color="CCCCCC"/>
-              <w:left w:val="single" w:sz="1" w:space="0" w:color="CCCCCC"/>
-              <w:bottom w:val="single" w:sz="1" w:space="0" w:color="CCCCCC"/>
-              <w:right w:val="single" w:sz="1" w:space="0" w:color="CCCCCC"/>
-            </w:tcBorders>
-            <w:tcMar>
-              <w:top w:w="55" w:type="dxa"/>
-              <w:left w:w="110" w:type="dxa"/>
-              <w:bottom w:w="55" w:type="dxa"/>
-              <w:right w:w="110" w:type="dxa"/>
-            </w:tcMar>
-            <w:shd w:val="clear" w:color="auto" w:fill="F7F9FC"/>
-            <w:vAlign w:val="center"/>
-          </w:tcPr>
-          <w:p>
-            <w:pPr>
-              <w:spacing w:before="40" w:after="40" w:line="240" w:lineRule="auto"/>
-              <w:jc w:val="left"/>
-            </w:pPr>
-            <w:r>
-              <w:rPr>
-                <w:sz w:val="18"/>
-                <w:szCs w:val="18"/>
-                <w:color w:val="202020"/>
-              </w:rPr>
-              <w:t>Decisión de aprobación, rechazo o excepción tomada por un usuario sobre una intervención.</w:t>
-            </w:r>
-          </w:p>
-        </w:tc>
-      </w:tr>
-      <w:tr>
-        <w:tblPrEx>
-          <w:tblCellMar>
-            <w:top w:w="0" w:type="dxa"/>
-            <w:bottom w:w="0" w:type="dxa"/>
-          </w:tblCellMar>
-        </w:tblPrEx>
-        <w:tc>
-          <w:tcPr>
-            <w:tcW w:w="2600" w:type="dxa"/>
-            <w:tcBorders>
-              <w:top w:val="single" w:sz="1" w:space="0" w:color="CCCCCC"/>
-              <w:left w:val="single" w:sz="1" w:space="0" w:color="CCCCCC"/>
-              <w:bottom w:val="single" w:sz="1" w:space="0" w:color="CCCCCC"/>
-              <w:right w:val="single" w:sz="1" w:space="0" w:color="CCCCCC"/>
-            </w:tcBorders>
-            <w:tcMar>
-              <w:top w:w="55" w:type="dxa"/>
-              <w:left w:w="110" w:type="dxa"/>
-              <w:bottom w:w="55" w:type="dxa"/>
-              <w:right w:w="110" w:type="dxa"/>
-            </w:tcMar>
-            <w:vAlign w:val="center"/>
-          </w:tcPr>
-          <w:p>
-            <w:pPr>
-              <w:spacing w:before="40" w:after="40" w:line="240" w:lineRule="auto"/>
-              <w:jc w:val="left"/>
-            </w:pPr>
-            <w:r>
-              <w:rPr>
-                <w:b/>
-                <w:bCs/>
-                <w:sz w:val="18"/>
-                <w:szCs w:val="18"/>
-                <w:color w:val="202020"/>
-              </w:rPr>
-              <w:t>ReservaRecurso</w:t>
-            </w:r>
-          </w:p>
-        </w:tc>
-        <w:tc>
-          <w:tcPr>
-            <w:tcW w:w="6760" w:type="dxa"/>
-            <w:tcBorders>
-              <w:top w:val="single" w:sz="1" w:space="0" w:color="CCCCCC"/>
-              <w:left w:val="single" w:sz="1" w:space="0" w:color="CCCCCC"/>
-              <w:bottom w:val="single" w:sz="1" w:space="0" w:color="CCCCCC"/>
-              <w:right w:val="single" w:sz="1" w:space="0" w:color="CCCCCC"/>
-            </w:tcBorders>
-            <w:tcMar>
-              <w:top w:w="55" w:type="dxa"/>
-              <w:left w:w="110" w:type="dxa"/>
-              <w:bottom w:w="55" w:type="dxa"/>
-              <w:right w:w="110" w:type="dxa"/>
-            </w:tcMar>
-            <w:vAlign w:val="center"/>
-          </w:tcPr>
-          <w:p>
-            <w:pPr>
-              <w:spacing w:before="40" w:after="40" w:line="240" w:lineRule="auto"/>
-              <w:jc w:val="left"/>
-            </w:pPr>
-            <w:r>
-              <w:rPr>
-                <w:sz w:val="18"/>
-                <w:szCs w:val="18"/>
-                <w:color w:val="202020"/>
-              </w:rPr>
-              <w:t>Reserva de un activo o una ubicación en un rango temporal, para control de exclusividad.</w:t>
-            </w:r>
-          </w:p>
-        </w:tc>
-      </w:tr>
-      <w:tr>
-        <w:tblPrEx>
-          <w:tblCellMar>
-            <w:top w:w="0" w:type="dxa"/>
-            <w:bottom w:w="0" w:type="dxa"/>
-          </w:tblCellMar>
-        </w:tblPrEx>
-        <w:tc>
-          <w:tcPr>
-            <w:tcW w:w="2600" w:type="dxa"/>
-            <w:tcBorders>
-              <w:top w:val="single" w:sz="1" w:space="0" w:color="CCCCCC"/>
-              <w:left w:val="single" w:sz="1" w:space="0" w:color="CCCCCC"/>
-              <w:bottom w:val="single" w:sz="1" w:space="0" w:color="CCCCCC"/>
-              <w:right w:val="single" w:sz="1" w:space="0" w:color="CCCCCC"/>
-            </w:tcBorders>
-            <w:tcMar>
-              <w:top w:w="55" w:type="dxa"/>
-              <w:left w:w="110" w:type="dxa"/>
-              <w:bottom w:w="55" w:type="dxa"/>
-              <w:right w:w="110" w:type="dxa"/>
-            </w:tcMar>
-            <w:shd w:val="clear" w:color="auto" w:fill="F7F9FC"/>
-            <w:vAlign w:val="center"/>
-          </w:tcPr>
-          <w:p>
-            <w:pPr>
-              <w:spacing w:before="40" w:after="40" w:line="240" w:lineRule="auto"/>
-              <w:jc w:val="left"/>
-            </w:pPr>
-            <w:r>
-              <w:rPr>
-                <w:b/>
-                <w:bCs/>
-                <w:sz w:val="18"/>
-                <w:szCs w:val="18"/>
-                <w:color w:val="202020"/>
-              </w:rPr>
-              <w:t>EntradaBitacora</w:t>
-            </w:r>
-          </w:p>
-        </w:tc>
-        <w:tc>
-          <w:tcPr>
-            <w:tcW w:w="6760" w:type="dxa"/>
-            <w:tcBorders>
-              <w:top w:val="single" w:sz="1" w:space="0" w:color="CCCCCC"/>
-              <w:left w:val="single" w:sz="1" w:space="0" w:color="CCCCCC"/>
-              <w:bottom w:val="single" w:sz="1" w:space="0" w:color="CCCCCC"/>
-              <w:right w:val="single" w:sz="1" w:space="0" w:color="CCCCCC"/>
-            </w:tcBorders>
-            <w:tcMar>
-              <w:top w:w="55" w:type="dxa"/>
-              <w:left w:w="110" w:type="dxa"/>
-              <w:bottom w:w="55" w:type="dxa"/>
-              <w:right w:w="110" w:type="dxa"/>
-            </w:tcMar>
-            <w:shd w:val="clear" w:color="auto" w:fill="F7F9FC"/>
-            <w:vAlign w:val="center"/>
-          </w:tcPr>
-          <w:p>
-            <w:pPr>
-              <w:spacing w:before="40" w:after="40" w:line="240" w:lineRule="auto"/>
-              <w:jc w:val="left"/>
-            </w:pPr>
-            <w:r>
-              <w:rPr>
-                <w:sz w:val="18"/>
-                <w:szCs w:val="18"/>
-                <w:color w:val="202020"/>
-              </w:rPr>
-              <w:t>Anotación de bitácora de una intervención realizada por un autor.</w:t>
-            </w:r>
-          </w:p>
-        </w:tc>
-      </w:tr>
-      <w:tr>
-        <w:tblPrEx>
-          <w:tblCellMar>
-            <w:top w:w="0" w:type="dxa"/>
-            <w:bottom w:w="0" w:type="dxa"/>
-          </w:tblCellMar>
-        </w:tblPrEx>
-        <w:tc>
-          <w:tcPr>
-            <w:tcW w:w="2600" w:type="dxa"/>
-            <w:tcBorders>
-              <w:top w:val="single" w:sz="1" w:space="0" w:color="CCCCCC"/>
-              <w:left w:val="single" w:sz="1" w:space="0" w:color="CCCCCC"/>
-              <w:bottom w:val="single" w:sz="1" w:space="0" w:color="CCCCCC"/>
-              <w:right w:val="single" w:sz="1" w:space="0" w:color="CCCCCC"/>
-            </w:tcBorders>
-            <w:tcMar>
-              <w:top w:w="55" w:type="dxa"/>
-              <w:left w:w="110" w:type="dxa"/>
-              <w:bottom w:w="55" w:type="dxa"/>
-              <w:right w:w="110" w:type="dxa"/>
-            </w:tcMar>
-            <w:vAlign w:val="center"/>
-          </w:tcPr>
-          <w:p>
-            <w:pPr>
-              <w:spacing w:before="40" w:after="40" w:line="240" w:lineRule="auto"/>
-              <w:jc w:val="left"/>
-            </w:pPr>
-            <w:r>
-              <w:rPr>
-                <w:b/>
-                <w:bCs/>
-                <w:sz w:val="18"/>
-                <w:szCs w:val="18"/>
-                <w:color w:val="202020"/>
-              </w:rPr>
-              <w:t>BitacoraActivo</w:t>
-            </w:r>
-          </w:p>
-        </w:tc>
-        <w:tc>
-          <w:tcPr>
-            <w:tcW w:w="6760" w:type="dxa"/>
-            <w:tcBorders>
-              <w:top w:val="single" w:sz="1" w:space="0" w:color="CCCCCC"/>
-              <w:left w:val="single" w:sz="1" w:space="0" w:color="CCCCCC"/>
-              <w:bottom w:val="single" w:sz="1" w:space="0" w:color="CCCCCC"/>
-              <w:right w:val="single" w:sz="1" w:space="0" w:color="CCCCCC"/>
-            </w:tcBorders>
-            <w:tcMar>
-              <w:top w:w="55" w:type="dxa"/>
-              <w:left w:w="110" w:type="dxa"/>
-              <w:bottom w:w="55" w:type="dxa"/>
-              <w:right w:w="110" w:type="dxa"/>
-            </w:tcMar>
-            <w:vAlign w:val="center"/>
-          </w:tcPr>
-          <w:p>
-            <w:pPr>
-              <w:spacing w:before="40" w:after="40" w:line="240" w:lineRule="auto"/>
-              <w:jc w:val="left"/>
-            </w:pPr>
-            <w:r>
-              <w:rPr>
-                <w:sz w:val="18"/>
-                <w:szCs w:val="18"/>
-                <w:color w:val="202020"/>
-              </w:rPr>
-              <w:t>Detalle de la acción registrada sobre un activo dentro de una entrada de bitácora.</w:t>
-            </w:r>
-          </w:p>
-        </w:tc>
-      </w:tr>
-      <w:tr>
-        <w:tblPrEx>
-          <w:tblCellMar>
-            <w:top w:w="0" w:type="dxa"/>
-            <w:bottom w:w="0" w:type="dxa"/>
-          </w:tblCellMar>
-        </w:tblPrEx>
-        <w:tc>
-          <w:tcPr>
-            <w:tcW w:w="2600" w:type="dxa"/>
-            <w:tcBorders>
-              <w:top w:val="single" w:sz="1" w:space="0" w:color="CCCCCC"/>
-              <w:left w:val="single" w:sz="1" w:space="0" w:color="CCCCCC"/>
-              <w:bottom w:val="single" w:sz="1" w:space="0" w:color="CCCCCC"/>
-              <w:right w:val="single" w:sz="1" w:space="0" w:color="CCCCCC"/>
-            </w:tcBorders>
-            <w:tcMar>
-              <w:top w:w="55" w:type="dxa"/>
-              <w:left w:w="110" w:type="dxa"/>
-              <w:bottom w:w="55" w:type="dxa"/>
-              <w:right w:w="110" w:type="dxa"/>
-            </w:tcMar>
-            <w:shd w:val="clear" w:color="auto" w:fill="F7F9FC"/>
-            <w:vAlign w:val="center"/>
-          </w:tcPr>
-          <w:p>
-            <w:pPr>
-              <w:spacing w:before="40" w:after="40" w:line="240" w:lineRule="auto"/>
-              <w:jc w:val="left"/>
-            </w:pPr>
-            <w:r>
-              <w:rPr>
-                <w:b/>
-                <w:bCs/>
-                <w:sz w:val="18"/>
-                <w:szCs w:val="18"/>
-                <w:color w:val="202020"/>
-              </w:rPr>
-              <w:t>ConfiguracionIntegracionZabbix</w:t>
-            </w:r>
-          </w:p>
-        </w:tc>
-        <w:tc>
-          <w:tcPr>
-            <w:tcW w:w="6760" w:type="dxa"/>
-            <w:tcBorders>
-              <w:top w:val="single" w:sz="1" w:space="0" w:color="CCCCCC"/>
-              <w:left w:val="single" w:sz="1" w:space="0" w:color="CCCCCC"/>
-              <w:bottom w:val="single" w:sz="1" w:space="0" w:color="CCCCCC"/>
-              <w:right w:val="single" w:sz="1" w:space="0" w:color="CCCCCC"/>
-            </w:tcBorders>
-            <w:tcMar>
-              <w:top w:w="55" w:type="dxa"/>
-              <w:left w:w="110" w:type="dxa"/>
-              <w:bottom w:w="55" w:type="dxa"/>
-              <w:right w:w="110" w:type="dxa"/>
-            </w:tcMar>
-            <w:shd w:val="clear" w:color="auto" w:fill="F7F9FC"/>
-            <w:vAlign w:val="center"/>
-          </w:tcPr>
-          <w:p>
-            <w:pPr>
-              <w:spacing w:before="40" w:after="40" w:line="240" w:lineRule="auto"/>
-              <w:jc w:val="left"/>
-            </w:pPr>
-            <w:r>
-              <w:rPr>
-                <w:sz w:val="18"/>
-                <w:szCs w:val="18"/>
-                <w:color w:val="202020"/>
-              </w:rPr>
-              <w:t>Parámetros de conexión a Zabbix (URL, referencia de credencial e intervalo de sincronización).</w:t>
-            </w:r>
-          </w:p>
-        </w:tc>
-      </w:tr>
-      <w:tr>
-        <w:tblPrEx>
-          <w:tblCellMar>
-            <w:top w:w="0" w:type="dxa"/>
-            <w:bottom w:w="0" w:type="dxa"/>
-          </w:tblCellMar>
-        </w:tblPrEx>
-        <w:tc>
-          <w:tcPr>
-            <w:tcW w:w="2600" w:type="dxa"/>
-            <w:tcBorders>
-              <w:top w:val="single" w:sz="1" w:space="0" w:color="CCCCCC"/>
-              <w:left w:val="single" w:sz="1" w:space="0" w:color="CCCCCC"/>
-              <w:bottom w:val="single" w:sz="1" w:space="0" w:color="CCCCCC"/>
-              <w:right w:val="single" w:sz="1" w:space="0" w:color="CCCCCC"/>
-            </w:tcBorders>
-            <w:tcMar>
-              <w:top w:w="55" w:type="dxa"/>
-              <w:left w:w="110" w:type="dxa"/>
-              <w:bottom w:w="55" w:type="dxa"/>
-              <w:right w:w="110" w:type="dxa"/>
-            </w:tcMar>
-            <w:vAlign w:val="center"/>
-          </w:tcPr>
-          <w:p>
-            <w:pPr>
-              <w:spacing w:before="40" w:after="40" w:line="240" w:lineRule="auto"/>
-              <w:jc w:val="left"/>
-            </w:pPr>
-            <w:r>
-              <w:rPr>
-                <w:b/>
-                <w:bCs/>
-                <w:sz w:val="18"/>
-                <w:szCs w:val="18"/>
-                <w:color w:val="202020"/>
-              </w:rPr>
-              <w:t>HostProblemaZabbix</w:t>
-            </w:r>
-          </w:p>
-        </w:tc>
-        <w:tc>
-          <w:tcPr>
-            <w:tcW w:w="6760" w:type="dxa"/>
-            <w:tcBorders>
-              <w:top w:val="single" w:sz="1" w:space="0" w:color="CCCCCC"/>
-              <w:left w:val="single" w:sz="1" w:space="0" w:color="CCCCCC"/>
-              <w:bottom w:val="single" w:sz="1" w:space="0" w:color="CCCCCC"/>
-              <w:right w:val="single" w:sz="1" w:space="0" w:color="CCCCCC"/>
-            </w:tcBorders>
-            <w:tcMar>
-              <w:top w:w="55" w:type="dxa"/>
-              <w:left w:w="110" w:type="dxa"/>
-              <w:bottom w:w="55" w:type="dxa"/>
-              <w:right w:w="110" w:type="dxa"/>
-            </w:tcMar>
-            <w:vAlign w:val="center"/>
-          </w:tcPr>
-          <w:p>
-            <w:pPr>
-              <w:spacing w:before="40" w:after="40" w:line="240" w:lineRule="auto"/>
-              <w:jc w:val="left"/>
-            </w:pPr>
-            <w:r>
-              <w:rPr>
-                <w:sz w:val="18"/>
-                <w:szCs w:val="18"/>
-                <w:color w:val="202020"/>
-              </w:rPr>
-              <w:t>Host o problema sincronizado desde Zabbix, opcionalmente vinculado a un activo.</w:t>
-            </w:r>
-          </w:p>
-        </w:tc>
-      </w:tr>
-      <w:tr>
-        <w:tblPrEx>
-          <w:tblCellMar>
-            <w:top w:w="0" w:type="dxa"/>
-            <w:bottom w:w="0" w:type="dxa"/>
-          </w:tblCellMar>
-        </w:tblPrEx>
-        <w:tc>
-          <w:tcPr>
-            <w:tcW w:w="2600" w:type="dxa"/>
-            <w:tcBorders>
-              <w:top w:val="single" w:sz="1" w:space="0" w:color="CCCCCC"/>
-              <w:left w:val="single" w:sz="1" w:space="0" w:color="CCCCCC"/>
-              <w:bottom w:val="single" w:sz="1" w:space="0" w:color="CCCCCC"/>
-              <w:right w:val="single" w:sz="1" w:space="0" w:color="CCCCCC"/>
-            </w:tcBorders>
-            <w:tcMar>
-              <w:top w:w="55" w:type="dxa"/>
-              <w:left w:w="110" w:type="dxa"/>
-              <w:bottom w:w="55" w:type="dxa"/>
-              <w:right w:w="110" w:type="dxa"/>
-            </w:tcMar>
-            <w:vAlign w:val="center"/>
-          </w:tcPr>
-          <w:p>
-            <w:pPr>
-              <w:spacing w:before="40" w:after="40" w:line="240" w:lineRule="auto"/>
-              <w:jc w:val="left"/>
-            </w:pPr>
-            <w:r>
-              <w:rPr>
-                <w:b/>
-                <w:bCs/>
-                <w:sz w:val="18"/>
-                <w:szCs w:val="18"/>
-                <w:color w:val="202020"/>
-              </w:rPr>
-              <w:t xml:space="preserve">EventoTecnicoIngesta</w:t>
-            </w:r>
-          </w:p>
-        </w:tc>
-        <w:tc>
-          <w:tcPr>
-            <w:tcW w:w="6760" w:type="dxa"/>
-            <w:tcBorders>
-              <w:top w:val="single" w:sz="1" w:space="0" w:color="CCCCCC"/>
-              <w:left w:val="single" w:sz="1" w:space="0" w:color="CCCCCC"/>
-              <w:bottom w:val="single" w:sz="1" w:space="0" w:color="CCCCCC"/>
-              <w:right w:val="single" w:sz="1" w:space="0" w:color="CCCCCC"/>
-            </w:tcBorders>
-            <w:tcMar>
-              <w:top w:w="55" w:type="dxa"/>
-              <w:left w:w="110" w:type="dxa"/>
-              <w:bottom w:w="55" w:type="dxa"/>
-              <w:right w:w="110" w:type="dxa"/>
-            </w:tcMar>
-            <w:vAlign w:val="center"/>
-          </w:tcPr>
-          <w:p>
-            <w:pPr>
-              <w:spacing w:before="40" w:after="40" w:line="240" w:lineRule="auto"/>
-              <w:jc w:val="left"/>
-            </w:pPr>
-            <w:r>
-              <w:rPr>
-                <w:sz w:val="18"/>
-                <w:szCs w:val="18"/>
-                <w:color w:val="202020"/>
-              </w:rPr>
-              <w:t xml:space="preserve">Registro inmutable de un rechazo o fallo de ingesta, con su causa y su contenido no sensible; conserva el código del sensor aunque este no esté registrado.</w:t>
+              <w:t>Rechazos y errores sin secretos; no es auditoría general.</w:t>
             </w:r>
           </w:p>
         </w:tc>
@@ -2504,7 +1932,7 @@
         <w:jc w:val="both"/>
       </w:pPr>
       <w:r>
-        <w:t>Las asociaciones se modelan como líneas simples y las dependencias existenciales como composición (rombo relleno). No se emplea herencia.</w:t>
+        <w:t>Las relaciones son asociaciones; no se requiere herencia ni composición de permisos físicos.</w:t>
       </w:r>
     </w:p>
     <w:p>
@@ -2521,10 +1949,7 @@
           <w:b/>
           <w:bCs/>
         </w:rPr>
-        <w:t xml:space="preserve">Inventario y ubicación: </w:t>
-      </w:r>
-      <w:r>
-        <w:t>Ubicacion 1 — 0..* Activo; Ubicacion con auto-referencia (jerarquía) 0..1 padre / 0..* hijas; Activo 1 — 0..* HistorialActivo y 1 — 0..* ArchivoAdjunto.</w:t>
+        <w:t>Ubicacion 1 → 0..* Activo; Activo 1 → 0..* HistorialActivo.</w:t>
       </w:r>
     </w:p>
     <w:p>
@@ -2541,10 +1966,7 @@
           <w:b/>
           <w:bCs/>
         </w:rPr>
-        <w:t xml:space="preserve">Telemetría: </w:t>
-      </w:r>
-      <w:r>
-        <w:t>Ubicacion 1 — 0..* Sensor; Sensor 1 — 0..* Medicion; Ubicacion 1 — 0..* UmbralAmbiental.</w:t>
+        <w:t>Sensor 1 → 0..* Medicion. Un umbral se aplica a una zona o dispositivo, sin ambigüedad.</w:t>
       </w:r>
     </w:p>
     <w:p>
@@ -2561,10 +1983,7 @@
           <w:b/>
           <w:bCs/>
         </w:rPr>
-        <w:t xml:space="preserve">Alertas: </w:t>
-      </w:r>
-      <w:r>
-        <w:t>Alerta con asociaciones opcionales separadas hacia Sensor (0..1), HostProblemaZabbix (0..1) y PuntoAcceso (0..1) según origen; Alerta 1 — 0..* EvidenciaAlerta; Alerta 0..1 — 0..* Notificacion.</w:t>
+        <w:t>Alerta referencia una medición o un evento Zabbix; Notificacion vincula alerta o intervención.</w:t>
       </w:r>
     </w:p>
     <w:p>
@@ -2581,10 +2000,7 @@
           <w:b/>
           <w:bCs/>
         </w:rPr>
-        <w:t xml:space="preserve">Accesos físicos: </w:t>
-      </w:r>
-      <w:r>
-        <w:t>PersonaAutorizada 1 — 0..* PermisoAcceso; PuntoAcceso 1 — 0..* PermisoAcceso; PermisoAcceso 1 ◆— 1..* PermisoDia (composición); PuntoAcceso 1 — 0..* EventoAcceso; PersonaAutorizada 0..1 — 0..* EventoAcceso.</w:t>
+        <w:t>PuntoAcceso 1 → 0..* EventoAcceso. La identidad física se conserva como identificador externo; no es una cuenta de aplicación ni un permiso propio.</w:t>
       </w:r>
     </w:p>
     <w:p>
@@ -2601,10 +2017,7 @@
           <w:b/>
           <w:bCs/>
         </w:rPr>
-        <w:t xml:space="preserve">Intervenciones: </w:t>
-      </w:r>
-      <w:r>
-        <w:t>Usuario 1 — 0..* Intervencion (responsable); Intervencion 1 — 0..* IntervencionActivo y Activo 1 — 0..* IntervencionActivo (puente N:M); Intervencion 1 — 0..* DecisionIntervencion / ReservaRecurso / EntradaBitacora; EntradaBitacora 1 — 0..* BitacoraActivo.</w:t>
+        <w:t>Intervencion N:M Activo mediante IntervencionActivo. Usuario 1 → 0..* Intervencion como responsable; Intervencion 1 → 0..* HistorialIntervencion.</w:t>
       </w:r>
     </w:p>
     <w:p>
@@ -2625,7 +2038,7 @@
         <w:spacing w:after="60"/>
       </w:pPr>
       <w:r>
-        <w:t>SICMA nunca almacena plantilla ni imagen biométrica: PersonaAutorizada solo guarda el identificador biométrico externo.</w:t>
+        <w:t>No se almacenan huellas. Altas y bajas físicas son externas, administradas por contratistas.</w:t>
       </w:r>
     </w:p>
     <w:p>
@@ -2651,7 +2064,7 @@
         <w:spacing w:after="60"/>
       </w:pPr>
       <w:r>
-        <w:t>RN-05: una alerta en estado 'Cerrada' no se reabre; una nueva ocurrencia genera una alerta distinta.</w:t>
+        <w:t>Las alertas corresponden a umbral o rendimiento. No se añade reconocimiento, cierre manual ni evidencia adjunta.</w:t>
       </w:r>
     </w:p>
     <w:p>
@@ -2664,7 +2077,7 @@
         <w:spacing w:after="60"/>
       </w:pPr>
       <w:r>
-        <w:t>RF-INT-03: IntervencionActivo y ReservaRecurso existen para impedir solapamientos sobre el mismo activo o ubicación.</w:t>
+        <w:t>RF-INT-03 se implementa como decisión y asignación; RF-INT-06 conserva activos e historial. El calendario es externo.</w:t>
       </w:r>
     </w:p>
     <w:p>
@@ -2712,7 +2125,7 @@
         <w:jc w:val="both"/>
       </w:pPr>
       <w:r>
-        <w:t>Cada clase del diagrama se corresponde 1:1 con una tabla del modelo relacional MySQL. La nomenclatura de tablas usa snake_case; los identificadores, tipos, claves y restricciones son coherentes con el DDL ya implementado en InnoDB Cluster.</w:t>
+        <w:t>Correspondencia objetivo clase–tabla. El script SQL anterior y el código deben migrarse y probarse en #9; este documento no acredita equivalencia con un DDL ya desplegado.</w:t>
       </w:r>
     </w:p>
     <w:p>
@@ -2966,7 +2379,7 @@
                 <w:szCs w:val="18"/>
                 <w:color w:val="202020"/>
               </w:rPr>
-              <w:t>Directa.</w:t>
+              <w:t>id; correo único; hash; rol; activo</w:t>
             </w:r>
           </w:p>
         </w:tc>
@@ -2993,7 +2406,6 @@
               <w:bottom w:w="55" w:type="dxa"/>
               <w:right w:w="110" w:type="dxa"/>
             </w:tcMar>
-            <w:shd w:val="clear" w:color="auto" w:fill="F7F9FC"/>
             <w:vAlign w:val="center"/>
           </w:tcPr>
           <w:p>
@@ -3009,7 +2421,7 @@
                 <w:szCs w:val="18"/>
                 <w:color w:val="202020"/>
               </w:rPr>
-              <w:t>Activo</w:t>
+              <w:t>Ubicacion</w:t>
             </w:r>
           </w:p>
         </w:tc>
@@ -3028,7 +2440,6 @@
               <w:bottom w:w="55" w:type="dxa"/>
               <w:right w:w="110" w:type="dxa"/>
             </w:tcMar>
-            <w:shd w:val="clear" w:color="auto" w:fill="F7F9FC"/>
             <w:vAlign w:val="center"/>
           </w:tcPr>
           <w:p>
@@ -3043,7 +2454,7 @@
                 <w:szCs w:val="18"/>
                 <w:color w:val="202020"/>
               </w:rPr>
-              <w:t>activo</w:t>
+              <w:t>ubicacion</w:t>
             </w:r>
           </w:p>
         </w:tc>
@@ -3062,21 +2473,20 @@
               <w:bottom w:w="55" w:type="dxa"/>
               <w:right w:w="110" w:type="dxa"/>
             </w:tcMar>
-            <w:shd w:val="clear" w:color="auto" w:fill="F7F9FC"/>
-            <w:vAlign w:val="center"/>
-          </w:tcPr>
-          <w:p>
-            <w:pPr>
-              <w:spacing w:before="40" w:after="40" w:line="240" w:lineRule="auto"/>
-              <w:jc w:val="left"/>
-            </w:pPr>
-            <w:r>
-              <w:rPr>
-                <w:sz w:val="18"/>
-                <w:szCs w:val="18"/>
-                <w:color w:val="202020"/>
-              </w:rPr>
-              <w:t>Directa.</w:t>
+            <w:vAlign w:val="center"/>
+          </w:tcPr>
+          <w:p>
+            <w:pPr>
+              <w:spacing w:before="40" w:after="40" w:line="240" w:lineRule="auto"/>
+              <w:jc w:val="left"/>
+            </w:pPr>
+            <w:r>
+              <w:rPr>
+                <w:sz w:val="18"/>
+                <w:szCs w:val="18"/>
+                <w:color w:val="202020"/>
+              </w:rPr>
+              <w:t>id; código; nombre</w:t>
             </w:r>
           </w:p>
         </w:tc>
@@ -3118,7 +2528,7 @@
                 <w:szCs w:val="18"/>
                 <w:color w:val="202020"/>
               </w:rPr>
-              <w:t>Ubicacion</w:t>
+              <w:t>Activo</w:t>
             </w:r>
           </w:p>
         </w:tc>
@@ -3151,7 +2561,7 @@
                 <w:szCs w:val="18"/>
                 <w:color w:val="202020"/>
               </w:rPr>
-              <w:t>ubicacion</w:t>
+              <w:t>activo</w:t>
             </w:r>
           </w:p>
         </w:tc>
@@ -3183,7 +2593,7 @@
                 <w:szCs w:val="18"/>
                 <w:color w:val="202020"/>
               </w:rPr>
-              <w:t>Auto-referencia ubicacion_padre_id (FK, nullable).</w:t>
+              <w:t>id; código único; tipo; estado; ubicación_id</w:t>
             </w:r>
           </w:p>
         </w:tc>
@@ -3210,7 +2620,6 @@
               <w:bottom w:w="55" w:type="dxa"/>
               <w:right w:w="110" w:type="dxa"/>
             </w:tcMar>
-            <w:shd w:val="clear" w:color="auto" w:fill="F7F9FC"/>
             <w:vAlign w:val="center"/>
           </w:tcPr>
           <w:p>
@@ -3245,7 +2654,6 @@
               <w:bottom w:w="55" w:type="dxa"/>
               <w:right w:w="110" w:type="dxa"/>
             </w:tcMar>
-            <w:shd w:val="clear" w:color="auto" w:fill="F7F9FC"/>
             <w:vAlign w:val="center"/>
           </w:tcPr>
           <w:p>
@@ -3279,21 +2687,20 @@
               <w:bottom w:w="55" w:type="dxa"/>
               <w:right w:w="110" w:type="dxa"/>
             </w:tcMar>
-            <w:shd w:val="clear" w:color="auto" w:fill="F7F9FC"/>
-            <w:vAlign w:val="center"/>
-          </w:tcPr>
-          <w:p>
-            <w:pPr>
-              <w:spacing w:before="40" w:after="40" w:line="240" w:lineRule="auto"/>
-              <w:jc w:val="left"/>
-            </w:pPr>
-            <w:r>
-              <w:rPr>
-                <w:sz w:val="18"/>
-                <w:szCs w:val="18"/>
-                <w:color w:val="202020"/>
-              </w:rPr>
-              <w:t>Solo inserción (append-only).</w:t>
+            <w:vAlign w:val="center"/>
+          </w:tcPr>
+          <w:p>
+            <w:pPr>
+              <w:spacing w:before="40" w:after="40" w:line="240" w:lineRule="auto"/>
+              <w:jc w:val="left"/>
+            </w:pPr>
+            <w:r>
+              <w:rPr>
+                <w:sz w:val="18"/>
+                <w:szCs w:val="18"/>
+                <w:color w:val="202020"/>
+              </w:rPr>
+              <w:t>id; activo_id; autor_id; fecha; cambio</w:t>
             </w:r>
           </w:p>
         </w:tc>
@@ -3335,7 +2742,7 @@
                 <w:szCs w:val="18"/>
                 <w:color w:val="202020"/>
               </w:rPr>
-              <w:t>ArchivoAdjunto</w:t>
+              <w:t>Sensor</w:t>
             </w:r>
           </w:p>
         </w:tc>
@@ -3368,7 +2775,7 @@
                 <w:szCs w:val="18"/>
                 <w:color w:val="202020"/>
               </w:rPr>
-              <w:t>archivo_adjunto</w:t>
+              <w:t>sensor</w:t>
             </w:r>
           </w:p>
         </w:tc>
@@ -3400,7 +2807,7 @@
                 <w:szCs w:val="18"/>
                 <w:color w:val="202020"/>
               </w:rPr>
-              <w:t>Directa.</w:t>
+              <w:t>id; código único; ubicación_id; credencial_hash</w:t>
             </w:r>
           </w:p>
         </w:tc>
@@ -3427,7 +2834,6 @@
               <w:bottom w:w="55" w:type="dxa"/>
               <w:right w:w="110" w:type="dxa"/>
             </w:tcMar>
-            <w:shd w:val="clear" w:color="auto" w:fill="F7F9FC"/>
             <w:vAlign w:val="center"/>
           </w:tcPr>
           <w:p>
@@ -3443,7 +2849,7 @@
                 <w:szCs w:val="18"/>
                 <w:color w:val="202020"/>
               </w:rPr>
-              <w:t>Sensor</w:t>
+              <w:t>Medicion</w:t>
             </w:r>
           </w:p>
         </w:tc>
@@ -3462,7 +2868,6 @@
               <w:bottom w:w="55" w:type="dxa"/>
               <w:right w:w="110" w:type="dxa"/>
             </w:tcMar>
-            <w:shd w:val="clear" w:color="auto" w:fill="F7F9FC"/>
             <w:vAlign w:val="center"/>
           </w:tcPr>
           <w:p>
@@ -3477,7 +2882,7 @@
                 <w:szCs w:val="18"/>
                 <w:color w:val="202020"/>
               </w:rPr>
-              <w:t>sensor</w:t>
+              <w:t>medicion</w:t>
             </w:r>
           </w:p>
         </w:tc>
@@ -3496,21 +2901,20 @@
               <w:bottom w:w="55" w:type="dxa"/>
               <w:right w:w="110" w:type="dxa"/>
             </w:tcMar>
-            <w:shd w:val="clear" w:color="auto" w:fill="F7F9FC"/>
-            <w:vAlign w:val="center"/>
-          </w:tcPr>
-          <w:p>
-            <w:pPr>
-              <w:spacing w:before="40" w:after="40" w:line="240" w:lineRule="auto"/>
-              <w:jc w:val="left"/>
-            </w:pPr>
-            <w:r>
-              <w:rPr>
-                <w:sz w:val="18"/>
-                <w:szCs w:val="18"/>
-                <w:color w:val="202020"/>
-              </w:rPr>
-              <w:t>El DDL añade device_key_hash (seguridad de ingesta).</w:t>
+            <w:vAlign w:val="center"/>
+          </w:tcPr>
+          <w:p>
+            <w:pPr>
+              <w:spacing w:before="40" w:after="40" w:line="240" w:lineRule="auto"/>
+              <w:jc w:val="left"/>
+            </w:pPr>
+            <w:r>
+              <w:rPr>
+                <w:sz w:val="18"/>
+                <w:szCs w:val="18"/>
+                <w:color w:val="202020"/>
+              </w:rPr>
+              <w:t>id; sensor_id; evento_id; temperatura; humedad; fechas</w:t>
             </w:r>
           </w:p>
         </w:tc>
@@ -3552,7 +2956,7 @@
                 <w:szCs w:val="18"/>
                 <w:color w:val="202020"/>
               </w:rPr>
-              <w:t>Medicion</w:t>
+              <w:t>UmbralAmbiental</w:t>
             </w:r>
           </w:p>
         </w:tc>
@@ -3585,7 +2989,7 @@
                 <w:szCs w:val="18"/>
                 <w:color w:val="202020"/>
               </w:rPr>
-              <w:t>medicion</w:t>
+              <w:t>umbral_ambiental</w:t>
             </w:r>
           </w:p>
         </w:tc>
@@ -3617,7 +3021,7 @@
                 <w:szCs w:val="18"/>
                 <w:color w:val="202020"/>
               </w:rPr>
-              <w:t>El DDL añade evento_id + UNIQUE(sensor_id, evento_id) y separa fecha_hora en medicion/recepcion.</w:t>
+              <w:t>id; zona_id o sensor_id; mínimo; máximo; variable</w:t>
             </w:r>
           </w:p>
         </w:tc>
@@ -3644,7 +3048,6 @@
               <w:bottom w:w="55" w:type="dxa"/>
               <w:right w:w="110" w:type="dxa"/>
             </w:tcMar>
-            <w:shd w:val="clear" w:color="auto" w:fill="F7F9FC"/>
             <w:vAlign w:val="center"/>
           </w:tcPr>
           <w:p>
@@ -3660,7 +3063,7 @@
                 <w:szCs w:val="18"/>
                 <w:color w:val="202020"/>
               </w:rPr>
-              <w:t>UmbralAmbiental</w:t>
+              <w:t>Alerta</w:t>
             </w:r>
           </w:p>
         </w:tc>
@@ -3679,7 +3082,6 @@
               <w:bottom w:w="55" w:type="dxa"/>
               <w:right w:w="110" w:type="dxa"/>
             </w:tcMar>
-            <w:shd w:val="clear" w:color="auto" w:fill="F7F9FC"/>
             <w:vAlign w:val="center"/>
           </w:tcPr>
           <w:p>
@@ -3694,7 +3096,7 @@
                 <w:szCs w:val="18"/>
                 <w:color w:val="202020"/>
               </w:rPr>
-              <w:t>umbral_ambiental</w:t>
+              <w:t>alerta</w:t>
             </w:r>
           </w:p>
         </w:tc>
@@ -3713,21 +3115,20 @@
               <w:bottom w:w="55" w:type="dxa"/>
               <w:right w:w="110" w:type="dxa"/>
             </w:tcMar>
-            <w:shd w:val="clear" w:color="auto" w:fill="F7F9FC"/>
-            <w:vAlign w:val="center"/>
-          </w:tcPr>
-          <w:p>
-            <w:pPr>
-              <w:spacing w:before="40" w:after="40" w:line="240" w:lineRule="auto"/>
-              <w:jc w:val="left"/>
-            </w:pPr>
-            <w:r>
-              <w:rPr>
-                <w:sz w:val="18"/>
-                <w:szCs w:val="18"/>
-                <w:color w:val="202020"/>
-              </w:rPr>
-              <w:t>Directa; atributo version para historización.</w:t>
+            <w:vAlign w:val="center"/>
+          </w:tcPr>
+          <w:p>
+            <w:pPr>
+              <w:spacing w:before="40" w:after="40" w:line="240" w:lineRule="auto"/>
+              <w:jc w:val="left"/>
+            </w:pPr>
+            <w:r>
+              <w:rPr>
+                <w:sz w:val="18"/>
+                <w:szCs w:val="18"/>
+                <w:color w:val="202020"/>
+              </w:rPr>
+              <w:t>id; medición_id o evento_zabbix_id; fecha; descripción</w:t>
             </w:r>
           </w:p>
         </w:tc>
@@ -3769,7 +3170,7 @@
                 <w:szCs w:val="18"/>
                 <w:color w:val="202020"/>
               </w:rPr>
-              <w:t>Alerta</w:t>
+              <w:t>Notificacion</w:t>
             </w:r>
           </w:p>
         </w:tc>
@@ -3802,7 +3203,7 @@
                 <w:szCs w:val="18"/>
                 <w:color w:val="202020"/>
               </w:rPr>
-              <w:t>alerta</w:t>
+              <w:t>notificacion</w:t>
             </w:r>
           </w:p>
         </w:tc>
@@ -3834,7 +3235,7 @@
                 <w:szCs w:val="18"/>
                 <w:color w:val="202020"/>
               </w:rPr>
-              <w:t>Asociaciones opcionales → FK nullable (sensor_id, host_problema_zabbix_id, punto_acceso_id).</w:t>
+              <w:t>id; alerta_id o intervención_id; canal; fecha; resultado</w:t>
             </w:r>
           </w:p>
         </w:tc>
@@ -3861,7 +3262,6 @@
               <w:bottom w:w="55" w:type="dxa"/>
               <w:right w:w="110" w:type="dxa"/>
             </w:tcMar>
-            <w:shd w:val="clear" w:color="auto" w:fill="F7F9FC"/>
             <w:vAlign w:val="center"/>
           </w:tcPr>
           <w:p>
@@ -3877,7 +3277,7 @@
                 <w:szCs w:val="18"/>
                 <w:color w:val="202020"/>
               </w:rPr>
-              <w:t>EvidenciaAlerta</w:t>
+              <w:t>PuntoAcceso</w:t>
             </w:r>
           </w:p>
         </w:tc>
@@ -3896,7 +3296,6 @@
               <w:bottom w:w="55" w:type="dxa"/>
               <w:right w:w="110" w:type="dxa"/>
             </w:tcMar>
-            <w:shd w:val="clear" w:color="auto" w:fill="F7F9FC"/>
             <w:vAlign w:val="center"/>
           </w:tcPr>
           <w:p>
@@ -3911,7 +3310,7 @@
                 <w:szCs w:val="18"/>
                 <w:color w:val="202020"/>
               </w:rPr>
-              <w:t>evidencia_alerta</w:t>
+              <w:t>punto_acceso</w:t>
             </w:r>
           </w:p>
         </w:tc>
@@ -3930,21 +3329,20 @@
               <w:bottom w:w="55" w:type="dxa"/>
               <w:right w:w="110" w:type="dxa"/>
             </w:tcMar>
-            <w:shd w:val="clear" w:color="auto" w:fill="F7F9FC"/>
-            <w:vAlign w:val="center"/>
-          </w:tcPr>
-          <w:p>
-            <w:pPr>
-              <w:spacing w:before="40" w:after="40" w:line="240" w:lineRule="auto"/>
-              <w:jc w:val="left"/>
-            </w:pPr>
-            <w:r>
-              <w:rPr>
-                <w:sz w:val="18"/>
-                <w:szCs w:val="18"/>
-                <w:color w:val="202020"/>
-              </w:rPr>
-              <w:t>Directa.</w:t>
+            <w:vAlign w:val="center"/>
+          </w:tcPr>
+          <w:p>
+            <w:pPr>
+              <w:spacing w:before="40" w:after="40" w:line="240" w:lineRule="auto"/>
+              <w:jc w:val="left"/>
+            </w:pPr>
+            <w:r>
+              <w:rPr>
+                <w:sz w:val="18"/>
+                <w:szCs w:val="18"/>
+                <w:color w:val="202020"/>
+              </w:rPr>
+              <w:t>id; identificador externo; ubicación_id</w:t>
             </w:r>
           </w:p>
         </w:tc>
@@ -3986,7 +3384,7 @@
                 <w:szCs w:val="18"/>
                 <w:color w:val="202020"/>
               </w:rPr>
-              <w:t>ReglaAlerta</w:t>
+              <w:t>EventoAcceso</w:t>
             </w:r>
           </w:p>
         </w:tc>
@@ -4019,7 +3417,7 @@
                 <w:szCs w:val="18"/>
                 <w:color w:val="202020"/>
               </w:rPr>
-              <w:t>regla_alerta</w:t>
+              <w:t>evento_acceso</w:t>
             </w:r>
           </w:p>
         </w:tc>
@@ -4051,7 +3449,7 @@
                 <w:szCs w:val="18"/>
                 <w:color w:val="202020"/>
               </w:rPr>
-              <w:t>destinatarios (lista) → JSON (o tabla normalizada opcional).</w:t>
+              <w:t>id; punto_id; evento_id; identidad externa; decisión; fechas</w:t>
             </w:r>
           </w:p>
         </w:tc>
@@ -4078,7 +3476,6 @@
               <w:bottom w:w="55" w:type="dxa"/>
               <w:right w:w="110" w:type="dxa"/>
             </w:tcMar>
-            <w:shd w:val="clear" w:color="auto" w:fill="F7F9FC"/>
             <w:vAlign w:val="center"/>
           </w:tcPr>
           <w:p>
@@ -4094,7 +3491,7 @@
                 <w:szCs w:val="18"/>
                 <w:color w:val="202020"/>
               </w:rPr>
-              <w:t>Notificacion</w:t>
+              <w:t>Intervencion</w:t>
             </w:r>
           </w:p>
         </w:tc>
@@ -4113,7 +3510,6 @@
               <w:bottom w:w="55" w:type="dxa"/>
               <w:right w:w="110" w:type="dxa"/>
             </w:tcMar>
-            <w:shd w:val="clear" w:color="auto" w:fill="F7F9FC"/>
             <w:vAlign w:val="center"/>
           </w:tcPr>
           <w:p>
@@ -4128,7 +3524,7 @@
                 <w:szCs w:val="18"/>
                 <w:color w:val="202020"/>
               </w:rPr>
-              <w:t>notificacion</w:t>
+              <w:t>intervencion</w:t>
             </w:r>
           </w:p>
         </w:tc>
@@ -4147,21 +3543,20 @@
               <w:bottom w:w="55" w:type="dxa"/>
               <w:right w:w="110" w:type="dxa"/>
             </w:tcMar>
-            <w:shd w:val="clear" w:color="auto" w:fill="F7F9FC"/>
-            <w:vAlign w:val="center"/>
-          </w:tcPr>
-          <w:p>
-            <w:pPr>
-              <w:spacing w:before="40" w:after="40" w:line="240" w:lineRule="auto"/>
-              <w:jc w:val="left"/>
-            </w:pPr>
-            <w:r>
-              <w:rPr>
-                <w:sz w:val="18"/>
-                <w:szCs w:val="18"/>
-                <w:color w:val="202020"/>
-              </w:rPr>
-              <w:t>alerta_id e intervencion_id nullable (SET NULL).</w:t>
+            <w:vAlign w:val="center"/>
+          </w:tcPr>
+          <w:p>
+            <w:pPr>
+              <w:spacing w:before="40" w:after="40" w:line="240" w:lineRule="auto"/>
+              <w:jc w:val="left"/>
+            </w:pPr>
+            <w:r>
+              <w:rPr>
+                <w:sz w:val="18"/>
+                <w:szCs w:val="18"/>
+                <w:color w:val="202020"/>
+              </w:rPr>
+              <w:t>id; forms_id único; calendario_id; responsable_id; estado; fechas</w:t>
             </w:r>
           </w:p>
         </w:tc>
@@ -4203,7 +3598,7 @@
                 <w:szCs w:val="18"/>
                 <w:color w:val="202020"/>
               </w:rPr>
-              <w:t>PersonaAutorizada</w:t>
+              <w:t>IntervencionActivo</w:t>
             </w:r>
           </w:p>
         </w:tc>
@@ -4236,7 +3631,7 @@
                 <w:szCs w:val="18"/>
                 <w:color w:val="202020"/>
               </w:rPr>
-              <w:t>persona_autorizada</w:t>
+              <w:t>intervencion_activo</w:t>
             </w:r>
           </w:p>
         </w:tc>
@@ -4268,7 +3663,7 @@
                 <w:szCs w:val="18"/>
                 <w:color w:val="202020"/>
               </w:rPr>
-              <w:t>identificador_biometrico_externo UNIQUE.</w:t>
+              <w:t>intervención_id; activo_id</w:t>
             </w:r>
           </w:p>
         </w:tc>
@@ -4295,7 +3690,6 @@
               <w:bottom w:w="55" w:type="dxa"/>
               <w:right w:w="110" w:type="dxa"/>
             </w:tcMar>
-            <w:shd w:val="clear" w:color="auto" w:fill="F7F9FC"/>
             <w:vAlign w:val="center"/>
           </w:tcPr>
           <w:p>
@@ -4311,7 +3705,7 @@
                 <w:szCs w:val="18"/>
                 <w:color w:val="202020"/>
               </w:rPr>
-              <w:t>PuntoAcceso</w:t>
+              <w:t>HistorialIntervencion</w:t>
             </w:r>
           </w:p>
         </w:tc>
@@ -4330,7 +3724,6 @@
               <w:bottom w:w="55" w:type="dxa"/>
               <w:right w:w="110" w:type="dxa"/>
             </w:tcMar>
-            <w:shd w:val="clear" w:color="auto" w:fill="F7F9FC"/>
             <w:vAlign w:val="center"/>
           </w:tcPr>
           <w:p>
@@ -4345,7 +3738,7 @@
                 <w:szCs w:val="18"/>
                 <w:color w:val="202020"/>
               </w:rPr>
-              <w:t>punto_acceso</w:t>
+              <w:t>historial_intervencion</w:t>
             </w:r>
           </w:p>
         </w:tc>
@@ -4364,21 +3757,20 @@
               <w:bottom w:w="55" w:type="dxa"/>
               <w:right w:w="110" w:type="dxa"/>
             </w:tcMar>
-            <w:shd w:val="clear" w:color="auto" w:fill="F7F9FC"/>
-            <w:vAlign w:val="center"/>
-          </w:tcPr>
-          <w:p>
-            <w:pPr>
-              <w:spacing w:before="40" w:after="40" w:line="240" w:lineRule="auto"/>
-              <w:jc w:val="left"/>
-            </w:pPr>
-            <w:r>
-              <w:rPr>
-                <w:sz w:val="18"/>
-                <w:szCs w:val="18"/>
-                <w:color w:val="202020"/>
-              </w:rPr>
-              <w:t>Directa.</w:t>
+            <w:vAlign w:val="center"/>
+          </w:tcPr>
+          <w:p>
+            <w:pPr>
+              <w:spacing w:before="40" w:after="40" w:line="240" w:lineRule="auto"/>
+              <w:jc w:val="left"/>
+            </w:pPr>
+            <w:r>
+              <w:rPr>
+                <w:sz w:val="18"/>
+                <w:szCs w:val="18"/>
+                <w:color w:val="202020"/>
+              </w:rPr>
+              <w:t>id; intervención_id; autor_id; estado; fecha; comentario</w:t>
             </w:r>
           </w:p>
         </w:tc>
@@ -4420,7 +3812,7 @@
                 <w:szCs w:val="18"/>
                 <w:color w:val="202020"/>
               </w:rPr>
-              <w:t>PermisoAcceso</w:t>
+              <w:t>HostZabbix</w:t>
             </w:r>
           </w:p>
         </w:tc>
@@ -4453,7 +3845,7 @@
                 <w:szCs w:val="18"/>
                 <w:color w:val="202020"/>
               </w:rPr>
-              <w:t>permiso_acceso</w:t>
+              <w:t>host_zabbix</w:t>
             </w:r>
           </w:p>
         </w:tc>
@@ -4485,7 +3877,7 @@
                 <w:szCs w:val="18"/>
                 <w:color w:val="202020"/>
               </w:rPr>
-              <w:t>Directa.</w:t>
+              <w:t>id; host_externo único; activo_id; estado; fecha</w:t>
             </w:r>
           </w:p>
         </w:tc>
@@ -4512,7 +3904,6 @@
               <w:bottom w:w="55" w:type="dxa"/>
               <w:right w:w="110" w:type="dxa"/>
             </w:tcMar>
-            <w:shd w:val="clear" w:color="auto" w:fill="F7F9FC"/>
             <w:vAlign w:val="center"/>
           </w:tcPr>
           <w:p>
@@ -4528,7 +3919,7 @@
                 <w:szCs w:val="18"/>
                 <w:color w:val="202020"/>
               </w:rPr>
-              <w:t>PermisoDia</w:t>
+              <w:t>EventoZabbix</w:t>
             </w:r>
           </w:p>
         </w:tc>
@@ -4547,7 +3938,6 @@
               <w:bottom w:w="55" w:type="dxa"/>
               <w:right w:w="110" w:type="dxa"/>
             </w:tcMar>
-            <w:shd w:val="clear" w:color="auto" w:fill="F7F9FC"/>
             <w:vAlign w:val="center"/>
           </w:tcPr>
           <w:p>
@@ -4562,7 +3952,7 @@
                 <w:szCs w:val="18"/>
                 <w:color w:val="202020"/>
               </w:rPr>
-              <w:t>permiso_dia</w:t>
+              <w:t>evento_zabbix</w:t>
             </w:r>
           </w:p>
         </w:tc>
@@ -4581,21 +3971,20 @@
               <w:bottom w:w="55" w:type="dxa"/>
               <w:right w:w="110" w:type="dxa"/>
             </w:tcMar>
-            <w:shd w:val="clear" w:color="auto" w:fill="F7F9FC"/>
-            <w:vAlign w:val="center"/>
-          </w:tcPr>
-          <w:p>
-            <w:pPr>
-              <w:spacing w:before="40" w:after="40" w:line="240" w:lineRule="auto"/>
-              <w:jc w:val="left"/>
-            </w:pPr>
-            <w:r>
-              <w:rPr>
-                <w:sz w:val="18"/>
-                <w:szCs w:val="18"/>
-                <w:color w:val="202020"/>
-              </w:rPr>
-              <w:t>Composición → FK ON DELETE CASCADE.</w:t>
+            <w:vAlign w:val="center"/>
+          </w:tcPr>
+          <w:p>
+            <w:pPr>
+              <w:spacing w:before="40" w:after="40" w:line="240" w:lineRule="auto"/>
+              <w:jc w:val="left"/>
+            </w:pPr>
+            <w:r>
+              <w:rPr>
+                <w:sz w:val="18"/>
+                <w:szCs w:val="18"/>
+                <w:color w:val="202020"/>
+              </w:rPr>
+              <w:t>id; host_id; evento_externo único; fecha; descripción</w:t>
             </w:r>
           </w:p>
         </w:tc>
@@ -4637,7 +4026,7 @@
                 <w:szCs w:val="18"/>
                 <w:color w:val="202020"/>
               </w:rPr>
-              <w:t>EventoAcceso</w:t>
+              <w:t>EventoTecnicoIngesta</w:t>
             </w:r>
           </w:p>
         </w:tc>
@@ -4670,7 +4059,7 @@
                 <w:szCs w:val="18"/>
                 <w:color w:val="202020"/>
               </w:rPr>
-              <w:t>evento_acceso</w:t>
+              <w:t>evento_tecnico_ingesta</w:t>
             </w:r>
           </w:p>
         </w:tc>
@@ -4702,982 +4091,7 @@
                 <w:szCs w:val="18"/>
                 <w:color w:val="202020"/>
               </w:rPr>
-              <w:t>Solo inserción; persona_id nullable (SET NULL).</w:t>
-            </w:r>
-          </w:p>
-        </w:tc>
-      </w:tr>
-      <w:tr>
-        <w:tblPrEx>
-          <w:tblCellMar>
-            <w:top w:w="0" w:type="dxa"/>
-            <w:bottom w:w="0" w:type="dxa"/>
-          </w:tblCellMar>
-        </w:tblPrEx>
-        <w:tc>
-          <w:tcPr>
-            <w:tcW w:w="2650" w:type="dxa"/>
-            <w:tcBorders>
-              <w:top w:val="single" w:sz="1" w:space="0" w:color="CCCCCC"/>
-              <w:left w:val="single" w:sz="1" w:space="0" w:color="CCCCCC"/>
-              <w:bottom w:val="single" w:sz="1" w:space="0" w:color="CCCCCC"/>
-              <w:right w:val="single" w:sz="1" w:space="0" w:color="CCCCCC"/>
-            </w:tcBorders>
-            <w:tcMar>
-              <w:top w:w="55" w:type="dxa"/>
-              <w:left w:w="110" w:type="dxa"/>
-              <w:bottom w:w="55" w:type="dxa"/>
-              <w:right w:w="110" w:type="dxa"/>
-            </w:tcMar>
-            <w:shd w:val="clear" w:color="auto" w:fill="F7F9FC"/>
-            <w:vAlign w:val="center"/>
-          </w:tcPr>
-          <w:p>
-            <w:pPr>
-              <w:spacing w:before="40" w:after="40" w:line="240" w:lineRule="auto"/>
-              <w:jc w:val="left"/>
-            </w:pPr>
-            <w:r>
-              <w:rPr>
-                <w:b/>
-                <w:bCs/>
-                <w:sz w:val="18"/>
-                <w:szCs w:val="18"/>
-                <w:color w:val="202020"/>
-              </w:rPr>
-              <w:t>Intervencion</w:t>
-            </w:r>
-          </w:p>
-        </w:tc>
-        <w:tc>
-          <w:tcPr>
-            <w:tcW w:w="2650" w:type="dxa"/>
-            <w:tcBorders>
-              <w:top w:val="single" w:sz="1" w:space="0" w:color="CCCCCC"/>
-              <w:left w:val="single" w:sz="1" w:space="0" w:color="CCCCCC"/>
-              <w:bottom w:val="single" w:sz="1" w:space="0" w:color="CCCCCC"/>
-              <w:right w:val="single" w:sz="1" w:space="0" w:color="CCCCCC"/>
-            </w:tcBorders>
-            <w:tcMar>
-              <w:top w:w="55" w:type="dxa"/>
-              <w:left w:w="110" w:type="dxa"/>
-              <w:bottom w:w="55" w:type="dxa"/>
-              <w:right w:w="110" w:type="dxa"/>
-            </w:tcMar>
-            <w:shd w:val="clear" w:color="auto" w:fill="F7F9FC"/>
-            <w:vAlign w:val="center"/>
-          </w:tcPr>
-          <w:p>
-            <w:pPr>
-              <w:spacing w:before="40" w:after="40" w:line="240" w:lineRule="auto"/>
-              <w:jc w:val="left"/>
-            </w:pPr>
-            <w:r>
-              <w:rPr>
-                <w:rFonts w:ascii="Consolas" w:eastAsia="Consolas" w:hAnsi="Consolas" w:cs="Consolas"/>
-                <w:sz w:val="18"/>
-                <w:szCs w:val="18"/>
-                <w:color w:val="202020"/>
-              </w:rPr>
-              <w:t>intervencion</w:t>
-            </w:r>
-          </w:p>
-        </w:tc>
-        <w:tc>
-          <w:tcPr>
-            <w:tcW w:w="4060" w:type="dxa"/>
-            <w:tcBorders>
-              <w:top w:val="single" w:sz="1" w:space="0" w:color="CCCCCC"/>
-              <w:left w:val="single" w:sz="1" w:space="0" w:color="CCCCCC"/>
-              <w:bottom w:val="single" w:sz="1" w:space="0" w:color="CCCCCC"/>
-              <w:right w:val="single" w:sz="1" w:space="0" w:color="CCCCCC"/>
-            </w:tcBorders>
-            <w:tcMar>
-              <w:top w:w="55" w:type="dxa"/>
-              <w:left w:w="110" w:type="dxa"/>
-              <w:bottom w:w="55" w:type="dxa"/>
-              <w:right w:w="110" w:type="dxa"/>
-            </w:tcMar>
-            <w:shd w:val="clear" w:color="auto" w:fill="F7F9FC"/>
-            <w:vAlign w:val="center"/>
-          </w:tcPr>
-          <w:p>
-            <w:pPr>
-              <w:spacing w:before="40" w:after="40" w:line="240" w:lineRule="auto"/>
-              <w:jc w:val="left"/>
-            </w:pPr>
-            <w:r>
-              <w:rPr>
-                <w:sz w:val="18"/>
-                <w:szCs w:val="18"/>
-                <w:color w:val="202020"/>
-              </w:rPr>
-              <w:t>responsable_id → usuario.</w:t>
-            </w:r>
-          </w:p>
-        </w:tc>
-      </w:tr>
-      <w:tr>
-        <w:tblPrEx>
-          <w:tblCellMar>
-            <w:top w:w="0" w:type="dxa"/>
-            <w:bottom w:w="0" w:type="dxa"/>
-          </w:tblCellMar>
-        </w:tblPrEx>
-        <w:tc>
-          <w:tcPr>
-            <w:tcW w:w="2650" w:type="dxa"/>
-            <w:tcBorders>
-              <w:top w:val="single" w:sz="1" w:space="0" w:color="CCCCCC"/>
-              <w:left w:val="single" w:sz="1" w:space="0" w:color="CCCCCC"/>
-              <w:bottom w:val="single" w:sz="1" w:space="0" w:color="CCCCCC"/>
-              <w:right w:val="single" w:sz="1" w:space="0" w:color="CCCCCC"/>
-            </w:tcBorders>
-            <w:tcMar>
-              <w:top w:w="55" w:type="dxa"/>
-              <w:left w:w="110" w:type="dxa"/>
-              <w:bottom w:w="55" w:type="dxa"/>
-              <w:right w:w="110" w:type="dxa"/>
-            </w:tcMar>
-            <w:vAlign w:val="center"/>
-          </w:tcPr>
-          <w:p>
-            <w:pPr>
-              <w:spacing w:before="40" w:after="40" w:line="240" w:lineRule="auto"/>
-              <w:jc w:val="left"/>
-            </w:pPr>
-            <w:r>
-              <w:rPr>
-                <w:b/>
-                <w:bCs/>
-                <w:sz w:val="18"/>
-                <w:szCs w:val="18"/>
-                <w:color w:val="202020"/>
-              </w:rPr>
-              <w:t>IntervencionActivo</w:t>
-            </w:r>
-          </w:p>
-        </w:tc>
-        <w:tc>
-          <w:tcPr>
-            <w:tcW w:w="2650" w:type="dxa"/>
-            <w:tcBorders>
-              <w:top w:val="single" w:sz="1" w:space="0" w:color="CCCCCC"/>
-              <w:left w:val="single" w:sz="1" w:space="0" w:color="CCCCCC"/>
-              <w:bottom w:val="single" w:sz="1" w:space="0" w:color="CCCCCC"/>
-              <w:right w:val="single" w:sz="1" w:space="0" w:color="CCCCCC"/>
-            </w:tcBorders>
-            <w:tcMar>
-              <w:top w:w="55" w:type="dxa"/>
-              <w:left w:w="110" w:type="dxa"/>
-              <w:bottom w:w="55" w:type="dxa"/>
-              <w:right w:w="110" w:type="dxa"/>
-            </w:tcMar>
-            <w:vAlign w:val="center"/>
-          </w:tcPr>
-          <w:p>
-            <w:pPr>
-              <w:spacing w:before="40" w:after="40" w:line="240" w:lineRule="auto"/>
-              <w:jc w:val="left"/>
-            </w:pPr>
-            <w:r>
-              <w:rPr>
-                <w:rFonts w:ascii="Consolas" w:eastAsia="Consolas" w:hAnsi="Consolas" w:cs="Consolas"/>
-                <w:sz w:val="18"/>
-                <w:szCs w:val="18"/>
-                <w:color w:val="202020"/>
-              </w:rPr>
-              <w:t>intervencion_activo</w:t>
-            </w:r>
-          </w:p>
-        </w:tc>
-        <w:tc>
-          <w:tcPr>
-            <w:tcW w:w="4060" w:type="dxa"/>
-            <w:tcBorders>
-              <w:top w:val="single" w:sz="1" w:space="0" w:color="CCCCCC"/>
-              <w:left w:val="single" w:sz="1" w:space="0" w:color="CCCCCC"/>
-              <w:bottom w:val="single" w:sz="1" w:space="0" w:color="CCCCCC"/>
-              <w:right w:val="single" w:sz="1" w:space="0" w:color="CCCCCC"/>
-            </w:tcBorders>
-            <w:tcMar>
-              <w:top w:w="55" w:type="dxa"/>
-              <w:left w:w="110" w:type="dxa"/>
-              <w:bottom w:w="55" w:type="dxa"/>
-              <w:right w:w="110" w:type="dxa"/>
-            </w:tcMar>
-            <w:vAlign w:val="center"/>
-          </w:tcPr>
-          <w:p>
-            <w:pPr>
-              <w:spacing w:before="40" w:after="40" w:line="240" w:lineRule="auto"/>
-              <w:jc w:val="left"/>
-            </w:pPr>
-            <w:r>
-              <w:rPr>
-                <w:sz w:val="18"/>
-                <w:szCs w:val="18"/>
-                <w:color w:val="202020"/>
-              </w:rPr>
-              <w:t>UNIQUE(intervencion_id, activo_id).</w:t>
-            </w:r>
-          </w:p>
-        </w:tc>
-      </w:tr>
-      <w:tr>
-        <w:tblPrEx>
-          <w:tblCellMar>
-            <w:top w:w="0" w:type="dxa"/>
-            <w:bottom w:w="0" w:type="dxa"/>
-          </w:tblCellMar>
-        </w:tblPrEx>
-        <w:tc>
-          <w:tcPr>
-            <w:tcW w:w="2650" w:type="dxa"/>
-            <w:tcBorders>
-              <w:top w:val="single" w:sz="1" w:space="0" w:color="CCCCCC"/>
-              <w:left w:val="single" w:sz="1" w:space="0" w:color="CCCCCC"/>
-              <w:bottom w:val="single" w:sz="1" w:space="0" w:color="CCCCCC"/>
-              <w:right w:val="single" w:sz="1" w:space="0" w:color="CCCCCC"/>
-            </w:tcBorders>
-            <w:tcMar>
-              <w:top w:w="55" w:type="dxa"/>
-              <w:left w:w="110" w:type="dxa"/>
-              <w:bottom w:w="55" w:type="dxa"/>
-              <w:right w:w="110" w:type="dxa"/>
-            </w:tcMar>
-            <w:shd w:val="clear" w:color="auto" w:fill="F7F9FC"/>
-            <w:vAlign w:val="center"/>
-          </w:tcPr>
-          <w:p>
-            <w:pPr>
-              <w:spacing w:before="40" w:after="40" w:line="240" w:lineRule="auto"/>
-              <w:jc w:val="left"/>
-            </w:pPr>
-            <w:r>
-              <w:rPr>
-                <w:b/>
-                <w:bCs/>
-                <w:sz w:val="18"/>
-                <w:szCs w:val="18"/>
-                <w:color w:val="202020"/>
-              </w:rPr>
-              <w:t>DecisionIntervencion</w:t>
-            </w:r>
-          </w:p>
-        </w:tc>
-        <w:tc>
-          <w:tcPr>
-            <w:tcW w:w="2650" w:type="dxa"/>
-            <w:tcBorders>
-              <w:top w:val="single" w:sz="1" w:space="0" w:color="CCCCCC"/>
-              <w:left w:val="single" w:sz="1" w:space="0" w:color="CCCCCC"/>
-              <w:bottom w:val="single" w:sz="1" w:space="0" w:color="CCCCCC"/>
-              <w:right w:val="single" w:sz="1" w:space="0" w:color="CCCCCC"/>
-            </w:tcBorders>
-            <w:tcMar>
-              <w:top w:w="55" w:type="dxa"/>
-              <w:left w:w="110" w:type="dxa"/>
-              <w:bottom w:w="55" w:type="dxa"/>
-              <w:right w:w="110" w:type="dxa"/>
-            </w:tcMar>
-            <w:shd w:val="clear" w:color="auto" w:fill="F7F9FC"/>
-            <w:vAlign w:val="center"/>
-          </w:tcPr>
-          <w:p>
-            <w:pPr>
-              <w:spacing w:before="40" w:after="40" w:line="240" w:lineRule="auto"/>
-              <w:jc w:val="left"/>
-            </w:pPr>
-            <w:r>
-              <w:rPr>
-                <w:rFonts w:ascii="Consolas" w:eastAsia="Consolas" w:hAnsi="Consolas" w:cs="Consolas"/>
-                <w:sz w:val="18"/>
-                <w:szCs w:val="18"/>
-                <w:color w:val="202020"/>
-              </w:rPr>
-              <w:t>decision_intervencion</w:t>
-            </w:r>
-          </w:p>
-        </w:tc>
-        <w:tc>
-          <w:tcPr>
-            <w:tcW w:w="4060" w:type="dxa"/>
-            <w:tcBorders>
-              <w:top w:val="single" w:sz="1" w:space="0" w:color="CCCCCC"/>
-              <w:left w:val="single" w:sz="1" w:space="0" w:color="CCCCCC"/>
-              <w:bottom w:val="single" w:sz="1" w:space="0" w:color="CCCCCC"/>
-              <w:right w:val="single" w:sz="1" w:space="0" w:color="CCCCCC"/>
-            </w:tcBorders>
-            <w:tcMar>
-              <w:top w:w="55" w:type="dxa"/>
-              <w:left w:w="110" w:type="dxa"/>
-              <w:bottom w:w="55" w:type="dxa"/>
-              <w:right w:w="110" w:type="dxa"/>
-            </w:tcMar>
-            <w:shd w:val="clear" w:color="auto" w:fill="F7F9FC"/>
-            <w:vAlign w:val="center"/>
-          </w:tcPr>
-          <w:p>
-            <w:pPr>
-              <w:spacing w:before="40" w:after="40" w:line="240" w:lineRule="auto"/>
-              <w:jc w:val="left"/>
-            </w:pPr>
-            <w:r>
-              <w:rPr>
-                <w:sz w:val="18"/>
-                <w:szCs w:val="18"/>
-                <w:color w:val="202020"/>
-              </w:rPr>
-              <w:t>decisor_id → usuario.</w:t>
-            </w:r>
-          </w:p>
-        </w:tc>
-      </w:tr>
-      <w:tr>
-        <w:tblPrEx>
-          <w:tblCellMar>
-            <w:top w:w="0" w:type="dxa"/>
-            <w:bottom w:w="0" w:type="dxa"/>
-          </w:tblCellMar>
-        </w:tblPrEx>
-        <w:tc>
-          <w:tcPr>
-            <w:tcW w:w="2650" w:type="dxa"/>
-            <w:tcBorders>
-              <w:top w:val="single" w:sz="1" w:space="0" w:color="CCCCCC"/>
-              <w:left w:val="single" w:sz="1" w:space="0" w:color="CCCCCC"/>
-              <w:bottom w:val="single" w:sz="1" w:space="0" w:color="CCCCCC"/>
-              <w:right w:val="single" w:sz="1" w:space="0" w:color="CCCCCC"/>
-            </w:tcBorders>
-            <w:tcMar>
-              <w:top w:w="55" w:type="dxa"/>
-              <w:left w:w="110" w:type="dxa"/>
-              <w:bottom w:w="55" w:type="dxa"/>
-              <w:right w:w="110" w:type="dxa"/>
-            </w:tcMar>
-            <w:vAlign w:val="center"/>
-          </w:tcPr>
-          <w:p>
-            <w:pPr>
-              <w:spacing w:before="40" w:after="40" w:line="240" w:lineRule="auto"/>
-              <w:jc w:val="left"/>
-            </w:pPr>
-            <w:r>
-              <w:rPr>
-                <w:b/>
-                <w:bCs/>
-                <w:sz w:val="18"/>
-                <w:szCs w:val="18"/>
-                <w:color w:val="202020"/>
-              </w:rPr>
-              <w:t>ReservaRecurso</w:t>
-            </w:r>
-          </w:p>
-        </w:tc>
-        <w:tc>
-          <w:tcPr>
-            <w:tcW w:w="2650" w:type="dxa"/>
-            <w:tcBorders>
-              <w:top w:val="single" w:sz="1" w:space="0" w:color="CCCCCC"/>
-              <w:left w:val="single" w:sz="1" w:space="0" w:color="CCCCCC"/>
-              <w:bottom w:val="single" w:sz="1" w:space="0" w:color="CCCCCC"/>
-              <w:right w:val="single" w:sz="1" w:space="0" w:color="CCCCCC"/>
-            </w:tcBorders>
-            <w:tcMar>
-              <w:top w:w="55" w:type="dxa"/>
-              <w:left w:w="110" w:type="dxa"/>
-              <w:bottom w:w="55" w:type="dxa"/>
-              <w:right w:w="110" w:type="dxa"/>
-            </w:tcMar>
-            <w:vAlign w:val="center"/>
-          </w:tcPr>
-          <w:p>
-            <w:pPr>
-              <w:spacing w:before="40" w:after="40" w:line="240" w:lineRule="auto"/>
-              <w:jc w:val="left"/>
-            </w:pPr>
-            <w:r>
-              <w:rPr>
-                <w:rFonts w:ascii="Consolas" w:eastAsia="Consolas" w:hAnsi="Consolas" w:cs="Consolas"/>
-                <w:sz w:val="18"/>
-                <w:szCs w:val="18"/>
-                <w:color w:val="202020"/>
-              </w:rPr>
-              <w:t>reserva_recurso</w:t>
-            </w:r>
-          </w:p>
-        </w:tc>
-        <w:tc>
-          <w:tcPr>
-            <w:tcW w:w="4060" w:type="dxa"/>
-            <w:tcBorders>
-              <w:top w:val="single" w:sz="1" w:space="0" w:color="CCCCCC"/>
-              <w:left w:val="single" w:sz="1" w:space="0" w:color="CCCCCC"/>
-              <w:bottom w:val="single" w:sz="1" w:space="0" w:color="CCCCCC"/>
-              <w:right w:val="single" w:sz="1" w:space="0" w:color="CCCCCC"/>
-            </w:tcBorders>
-            <w:tcMar>
-              <w:top w:w="55" w:type="dxa"/>
-              <w:left w:w="110" w:type="dxa"/>
-              <w:bottom w:w="55" w:type="dxa"/>
-              <w:right w:w="110" w:type="dxa"/>
-            </w:tcMar>
-            <w:vAlign w:val="center"/>
-          </w:tcPr>
-          <w:p>
-            <w:pPr>
-              <w:spacing w:before="40" w:after="40" w:line="240" w:lineRule="auto"/>
-              <w:jc w:val="left"/>
-            </w:pPr>
-            <w:r>
-              <w:rPr>
-                <w:sz w:val="18"/>
-                <w:szCs w:val="18"/>
-                <w:color w:val="202020"/>
-              </w:rPr>
-              <w:t>activo_id/ubicacion_id nullable; índices de solapamiento por rango.</w:t>
-            </w:r>
-          </w:p>
-        </w:tc>
-      </w:tr>
-      <w:tr>
-        <w:tblPrEx>
-          <w:tblCellMar>
-            <w:top w:w="0" w:type="dxa"/>
-            <w:bottom w:w="0" w:type="dxa"/>
-          </w:tblCellMar>
-        </w:tblPrEx>
-        <w:tc>
-          <w:tcPr>
-            <w:tcW w:w="2650" w:type="dxa"/>
-            <w:tcBorders>
-              <w:top w:val="single" w:sz="1" w:space="0" w:color="CCCCCC"/>
-              <w:left w:val="single" w:sz="1" w:space="0" w:color="CCCCCC"/>
-              <w:bottom w:val="single" w:sz="1" w:space="0" w:color="CCCCCC"/>
-              <w:right w:val="single" w:sz="1" w:space="0" w:color="CCCCCC"/>
-            </w:tcBorders>
-            <w:tcMar>
-              <w:top w:w="55" w:type="dxa"/>
-              <w:left w:w="110" w:type="dxa"/>
-              <w:bottom w:w="55" w:type="dxa"/>
-              <w:right w:w="110" w:type="dxa"/>
-            </w:tcMar>
-            <w:shd w:val="clear" w:color="auto" w:fill="F7F9FC"/>
-            <w:vAlign w:val="center"/>
-          </w:tcPr>
-          <w:p>
-            <w:pPr>
-              <w:spacing w:before="40" w:after="40" w:line="240" w:lineRule="auto"/>
-              <w:jc w:val="left"/>
-            </w:pPr>
-            <w:r>
-              <w:rPr>
-                <w:b/>
-                <w:bCs/>
-                <w:sz w:val="18"/>
-                <w:szCs w:val="18"/>
-                <w:color w:val="202020"/>
-              </w:rPr>
-              <w:t>EntradaBitacora</w:t>
-            </w:r>
-          </w:p>
-        </w:tc>
-        <w:tc>
-          <w:tcPr>
-            <w:tcW w:w="2650" w:type="dxa"/>
-            <w:tcBorders>
-              <w:top w:val="single" w:sz="1" w:space="0" w:color="CCCCCC"/>
-              <w:left w:val="single" w:sz="1" w:space="0" w:color="CCCCCC"/>
-              <w:bottom w:val="single" w:sz="1" w:space="0" w:color="CCCCCC"/>
-              <w:right w:val="single" w:sz="1" w:space="0" w:color="CCCCCC"/>
-            </w:tcBorders>
-            <w:tcMar>
-              <w:top w:w="55" w:type="dxa"/>
-              <w:left w:w="110" w:type="dxa"/>
-              <w:bottom w:w="55" w:type="dxa"/>
-              <w:right w:w="110" w:type="dxa"/>
-            </w:tcMar>
-            <w:shd w:val="clear" w:color="auto" w:fill="F7F9FC"/>
-            <w:vAlign w:val="center"/>
-          </w:tcPr>
-          <w:p>
-            <w:pPr>
-              <w:spacing w:before="40" w:after="40" w:line="240" w:lineRule="auto"/>
-              <w:jc w:val="left"/>
-            </w:pPr>
-            <w:r>
-              <w:rPr>
-                <w:rFonts w:ascii="Consolas" w:eastAsia="Consolas" w:hAnsi="Consolas" w:cs="Consolas"/>
-                <w:sz w:val="18"/>
-                <w:szCs w:val="18"/>
-                <w:color w:val="202020"/>
-              </w:rPr>
-              <w:t>entrada_bitacora</w:t>
-            </w:r>
-          </w:p>
-        </w:tc>
-        <w:tc>
-          <w:tcPr>
-            <w:tcW w:w="4060" w:type="dxa"/>
-            <w:tcBorders>
-              <w:top w:val="single" w:sz="1" w:space="0" w:color="CCCCCC"/>
-              <w:left w:val="single" w:sz="1" w:space="0" w:color="CCCCCC"/>
-              <w:bottom w:val="single" w:sz="1" w:space="0" w:color="CCCCCC"/>
-              <w:right w:val="single" w:sz="1" w:space="0" w:color="CCCCCC"/>
-            </w:tcBorders>
-            <w:tcMar>
-              <w:top w:w="55" w:type="dxa"/>
-              <w:left w:w="110" w:type="dxa"/>
-              <w:bottom w:w="55" w:type="dxa"/>
-              <w:right w:w="110" w:type="dxa"/>
-            </w:tcMar>
-            <w:shd w:val="clear" w:color="auto" w:fill="F7F9FC"/>
-            <w:vAlign w:val="center"/>
-          </w:tcPr>
-          <w:p>
-            <w:pPr>
-              <w:spacing w:before="40" w:after="40" w:line="240" w:lineRule="auto"/>
-              <w:jc w:val="left"/>
-            </w:pPr>
-            <w:r>
-              <w:rPr>
-                <w:sz w:val="18"/>
-                <w:szCs w:val="18"/>
-                <w:color w:val="202020"/>
-              </w:rPr>
-              <w:t>autor_id → usuario.</w:t>
-            </w:r>
-          </w:p>
-        </w:tc>
-      </w:tr>
-      <w:tr>
-        <w:tblPrEx>
-          <w:tblCellMar>
-            <w:top w:w="0" w:type="dxa"/>
-            <w:bottom w:w="0" w:type="dxa"/>
-          </w:tblCellMar>
-        </w:tblPrEx>
-        <w:tc>
-          <w:tcPr>
-            <w:tcW w:w="2650" w:type="dxa"/>
-            <w:tcBorders>
-              <w:top w:val="single" w:sz="1" w:space="0" w:color="CCCCCC"/>
-              <w:left w:val="single" w:sz="1" w:space="0" w:color="CCCCCC"/>
-              <w:bottom w:val="single" w:sz="1" w:space="0" w:color="CCCCCC"/>
-              <w:right w:val="single" w:sz="1" w:space="0" w:color="CCCCCC"/>
-            </w:tcBorders>
-            <w:tcMar>
-              <w:top w:w="55" w:type="dxa"/>
-              <w:left w:w="110" w:type="dxa"/>
-              <w:bottom w:w="55" w:type="dxa"/>
-              <w:right w:w="110" w:type="dxa"/>
-            </w:tcMar>
-            <w:vAlign w:val="center"/>
-          </w:tcPr>
-          <w:p>
-            <w:pPr>
-              <w:spacing w:before="40" w:after="40" w:line="240" w:lineRule="auto"/>
-              <w:jc w:val="left"/>
-            </w:pPr>
-            <w:r>
-              <w:rPr>
-                <w:b/>
-                <w:bCs/>
-                <w:sz w:val="18"/>
-                <w:szCs w:val="18"/>
-                <w:color w:val="202020"/>
-              </w:rPr>
-              <w:t>BitacoraActivo</w:t>
-            </w:r>
-          </w:p>
-        </w:tc>
-        <w:tc>
-          <w:tcPr>
-            <w:tcW w:w="2650" w:type="dxa"/>
-            <w:tcBorders>
-              <w:top w:val="single" w:sz="1" w:space="0" w:color="CCCCCC"/>
-              <w:left w:val="single" w:sz="1" w:space="0" w:color="CCCCCC"/>
-              <w:bottom w:val="single" w:sz="1" w:space="0" w:color="CCCCCC"/>
-              <w:right w:val="single" w:sz="1" w:space="0" w:color="CCCCCC"/>
-            </w:tcBorders>
-            <w:tcMar>
-              <w:top w:w="55" w:type="dxa"/>
-              <w:left w:w="110" w:type="dxa"/>
-              <w:bottom w:w="55" w:type="dxa"/>
-              <w:right w:w="110" w:type="dxa"/>
-            </w:tcMar>
-            <w:vAlign w:val="center"/>
-          </w:tcPr>
-          <w:p>
-            <w:pPr>
-              <w:spacing w:before="40" w:after="40" w:line="240" w:lineRule="auto"/>
-              <w:jc w:val="left"/>
-            </w:pPr>
-            <w:r>
-              <w:rPr>
-                <w:rFonts w:ascii="Consolas" w:eastAsia="Consolas" w:hAnsi="Consolas" w:cs="Consolas"/>
-                <w:sz w:val="18"/>
-                <w:szCs w:val="18"/>
-                <w:color w:val="202020"/>
-              </w:rPr>
-              <w:t>bitacora_activo</w:t>
-            </w:r>
-          </w:p>
-        </w:tc>
-        <w:tc>
-          <w:tcPr>
-            <w:tcW w:w="4060" w:type="dxa"/>
-            <w:tcBorders>
-              <w:top w:val="single" w:sz="1" w:space="0" w:color="CCCCCC"/>
-              <w:left w:val="single" w:sz="1" w:space="0" w:color="CCCCCC"/>
-              <w:bottom w:val="single" w:sz="1" w:space="0" w:color="CCCCCC"/>
-              <w:right w:val="single" w:sz="1" w:space="0" w:color="CCCCCC"/>
-            </w:tcBorders>
-            <w:tcMar>
-              <w:top w:w="55" w:type="dxa"/>
-              <w:left w:w="110" w:type="dxa"/>
-              <w:bottom w:w="55" w:type="dxa"/>
-              <w:right w:w="110" w:type="dxa"/>
-            </w:tcMar>
-            <w:vAlign w:val="center"/>
-          </w:tcPr>
-          <w:p>
-            <w:pPr>
-              <w:spacing w:before="40" w:after="40" w:line="240" w:lineRule="auto"/>
-              <w:jc w:val="left"/>
-            </w:pPr>
-            <w:r>
-              <w:rPr>
-                <w:sz w:val="18"/>
-                <w:szCs w:val="18"/>
-                <w:color w:val="202020"/>
-              </w:rPr>
-              <w:t>Directa.</w:t>
-            </w:r>
-          </w:p>
-        </w:tc>
-      </w:tr>
-      <w:tr>
-        <w:tblPrEx>
-          <w:tblCellMar>
-            <w:top w:w="0" w:type="dxa"/>
-            <w:bottom w:w="0" w:type="dxa"/>
-          </w:tblCellMar>
-        </w:tblPrEx>
-        <w:tc>
-          <w:tcPr>
-            <w:tcW w:w="2650" w:type="dxa"/>
-            <w:tcBorders>
-              <w:top w:val="single" w:sz="1" w:space="0" w:color="CCCCCC"/>
-              <w:left w:val="single" w:sz="1" w:space="0" w:color="CCCCCC"/>
-              <w:bottom w:val="single" w:sz="1" w:space="0" w:color="CCCCCC"/>
-              <w:right w:val="single" w:sz="1" w:space="0" w:color="CCCCCC"/>
-            </w:tcBorders>
-            <w:tcMar>
-              <w:top w:w="55" w:type="dxa"/>
-              <w:left w:w="110" w:type="dxa"/>
-              <w:bottom w:w="55" w:type="dxa"/>
-              <w:right w:w="110" w:type="dxa"/>
-            </w:tcMar>
-            <w:shd w:val="clear" w:color="auto" w:fill="F7F9FC"/>
-            <w:vAlign w:val="center"/>
-          </w:tcPr>
-          <w:p>
-            <w:pPr>
-              <w:spacing w:before="40" w:after="40" w:line="240" w:lineRule="auto"/>
-              <w:jc w:val="left"/>
-            </w:pPr>
-            <w:r>
-              <w:rPr>
-                <w:b/>
-                <w:bCs/>
-                <w:sz w:val="18"/>
-                <w:szCs w:val="18"/>
-                <w:color w:val="202020"/>
-              </w:rPr>
-              <w:t>ConfiguracionIntegracionZabbix</w:t>
-            </w:r>
-          </w:p>
-        </w:tc>
-        <w:tc>
-          <w:tcPr>
-            <w:tcW w:w="2650" w:type="dxa"/>
-            <w:tcBorders>
-              <w:top w:val="single" w:sz="1" w:space="0" w:color="CCCCCC"/>
-              <w:left w:val="single" w:sz="1" w:space="0" w:color="CCCCCC"/>
-              <w:bottom w:val="single" w:sz="1" w:space="0" w:color="CCCCCC"/>
-              <w:right w:val="single" w:sz="1" w:space="0" w:color="CCCCCC"/>
-            </w:tcBorders>
-            <w:tcMar>
-              <w:top w:w="55" w:type="dxa"/>
-              <w:left w:w="110" w:type="dxa"/>
-              <w:bottom w:w="55" w:type="dxa"/>
-              <w:right w:w="110" w:type="dxa"/>
-            </w:tcMar>
-            <w:shd w:val="clear" w:color="auto" w:fill="F7F9FC"/>
-            <w:vAlign w:val="center"/>
-          </w:tcPr>
-          <w:p>
-            <w:pPr>
-              <w:spacing w:before="40" w:after="40" w:line="240" w:lineRule="auto"/>
-              <w:jc w:val="left"/>
-            </w:pPr>
-            <w:r>
-              <w:rPr>
-                <w:rFonts w:ascii="Consolas" w:eastAsia="Consolas" w:hAnsi="Consolas" w:cs="Consolas"/>
-                <w:sz w:val="18"/>
-                <w:szCs w:val="18"/>
-                <w:color w:val="202020"/>
-              </w:rPr>
-              <w:t>configuracion_integracion_zabbix</w:t>
-            </w:r>
-          </w:p>
-        </w:tc>
-        <w:tc>
-          <w:tcPr>
-            <w:tcW w:w="4060" w:type="dxa"/>
-            <w:tcBorders>
-              <w:top w:val="single" w:sz="1" w:space="0" w:color="CCCCCC"/>
-              <w:left w:val="single" w:sz="1" w:space="0" w:color="CCCCCC"/>
-              <w:bottom w:val="single" w:sz="1" w:space="0" w:color="CCCCCC"/>
-              <w:right w:val="single" w:sz="1" w:space="0" w:color="CCCCCC"/>
-            </w:tcBorders>
-            <w:tcMar>
-              <w:top w:w="55" w:type="dxa"/>
-              <w:left w:w="110" w:type="dxa"/>
-              <w:bottom w:w="55" w:type="dxa"/>
-              <w:right w:w="110" w:type="dxa"/>
-            </w:tcMar>
-            <w:shd w:val="clear" w:color="auto" w:fill="F7F9FC"/>
-            <w:vAlign w:val="center"/>
-          </w:tcPr>
-          <w:p>
-            <w:pPr>
-              <w:spacing w:before="40" w:after="40" w:line="240" w:lineRule="auto"/>
-              <w:jc w:val="left"/>
-            </w:pPr>
-            <w:r>
-              <w:rPr>
-                <w:sz w:val="18"/>
-                <w:szCs w:val="18"/>
-                <w:color w:val="202020"/>
-              </w:rPr>
-              <w:t>credencial_referencia (nunca en texto claro).</w:t>
-            </w:r>
-          </w:p>
-        </w:tc>
-      </w:tr>
-      <w:tr>
-        <w:tblPrEx>
-          <w:tblCellMar>
-            <w:top w:w="0" w:type="dxa"/>
-            <w:bottom w:w="0" w:type="dxa"/>
-          </w:tblCellMar>
-        </w:tblPrEx>
-        <w:tc>
-          <w:tcPr>
-            <w:tcW w:w="2650" w:type="dxa"/>
-            <w:tcBorders>
-              <w:top w:val="single" w:sz="1" w:space="0" w:color="CCCCCC"/>
-              <w:left w:val="single" w:sz="1" w:space="0" w:color="CCCCCC"/>
-              <w:bottom w:val="single" w:sz="1" w:space="0" w:color="CCCCCC"/>
-              <w:right w:val="single" w:sz="1" w:space="0" w:color="CCCCCC"/>
-            </w:tcBorders>
-            <w:tcMar>
-              <w:top w:w="55" w:type="dxa"/>
-              <w:left w:w="110" w:type="dxa"/>
-              <w:bottom w:w="55" w:type="dxa"/>
-              <w:right w:w="110" w:type="dxa"/>
-            </w:tcMar>
-            <w:vAlign w:val="center"/>
-          </w:tcPr>
-          <w:p>
-            <w:pPr>
-              <w:spacing w:before="40" w:after="40" w:line="240" w:lineRule="auto"/>
-              <w:jc w:val="left"/>
-            </w:pPr>
-            <w:r>
-              <w:rPr>
-                <w:b/>
-                <w:bCs/>
-                <w:sz w:val="18"/>
-                <w:szCs w:val="18"/>
-                <w:color w:val="202020"/>
-              </w:rPr>
-              <w:t>HostProblemaZabbix</w:t>
-            </w:r>
-          </w:p>
-        </w:tc>
-        <w:tc>
-          <w:tcPr>
-            <w:tcW w:w="2650" w:type="dxa"/>
-            <w:tcBorders>
-              <w:top w:val="single" w:sz="1" w:space="0" w:color="CCCCCC"/>
-              <w:left w:val="single" w:sz="1" w:space="0" w:color="CCCCCC"/>
-              <w:bottom w:val="single" w:sz="1" w:space="0" w:color="CCCCCC"/>
-              <w:right w:val="single" w:sz="1" w:space="0" w:color="CCCCCC"/>
-            </w:tcBorders>
-            <w:tcMar>
-              <w:top w:w="55" w:type="dxa"/>
-              <w:left w:w="110" w:type="dxa"/>
-              <w:bottom w:w="55" w:type="dxa"/>
-              <w:right w:w="110" w:type="dxa"/>
-            </w:tcMar>
-            <w:vAlign w:val="center"/>
-          </w:tcPr>
-          <w:p>
-            <w:pPr>
-              <w:spacing w:before="40" w:after="40" w:line="240" w:lineRule="auto"/>
-              <w:jc w:val="left"/>
-            </w:pPr>
-            <w:r>
-              <w:rPr>
-                <w:rFonts w:ascii="Consolas" w:eastAsia="Consolas" w:hAnsi="Consolas" w:cs="Consolas"/>
-                <w:sz w:val="18"/>
-                <w:szCs w:val="18"/>
-                <w:color w:val="202020"/>
-              </w:rPr>
-              <w:t>host_problema_zabbix</w:t>
-            </w:r>
-          </w:p>
-        </w:tc>
-        <w:tc>
-          <w:tcPr>
-            <w:tcW w:w="4060" w:type="dxa"/>
-            <w:tcBorders>
-              <w:top w:val="single" w:sz="1" w:space="0" w:color="CCCCCC"/>
-              <w:left w:val="single" w:sz="1" w:space="0" w:color="CCCCCC"/>
-              <w:bottom w:val="single" w:sz="1" w:space="0" w:color="CCCCCC"/>
-              <w:right w:val="single" w:sz="1" w:space="0" w:color="CCCCCC"/>
-            </w:tcBorders>
-            <w:tcMar>
-              <w:top w:w="55" w:type="dxa"/>
-              <w:left w:w="110" w:type="dxa"/>
-              <w:bottom w:w="55" w:type="dxa"/>
-              <w:right w:w="110" w:type="dxa"/>
-            </w:tcMar>
-            <w:vAlign w:val="center"/>
-          </w:tcPr>
-          <w:p>
-            <w:pPr>
-              <w:spacing w:before="40" w:after="40" w:line="240" w:lineRule="auto"/>
-              <w:jc w:val="left"/>
-            </w:pPr>
-            <w:r>
-              <w:rPr>
-                <w:sz w:val="18"/>
-                <w:szCs w:val="18"/>
-                <w:color w:val="202020"/>
-              </w:rPr>
-              <w:t>identificador_externo UNIQUE; activo_id nullable (SET NULL).</w:t>
-            </w:r>
-          </w:p>
-        </w:tc>
-      </w:tr>
-      <w:tr>
-        <w:tblPrEx>
-          <w:tblCellMar>
-            <w:top w:w="0" w:type="dxa"/>
-            <w:bottom w:w="0" w:type="dxa"/>
-          </w:tblCellMar>
-        </w:tblPrEx>
-        <w:tc>
-          <w:tcPr>
-            <w:tcW w:w="2650" w:type="dxa"/>
-            <w:tcBorders>
-              <w:top w:val="single" w:sz="1" w:space="0" w:color="CCCCCC"/>
-              <w:left w:val="single" w:sz="1" w:space="0" w:color="CCCCCC"/>
-              <w:bottom w:val="single" w:sz="1" w:space="0" w:color="CCCCCC"/>
-              <w:right w:val="single" w:sz="1" w:space="0" w:color="CCCCCC"/>
-            </w:tcBorders>
-            <w:tcMar>
-              <w:top w:w="55" w:type="dxa"/>
-              <w:left w:w="110" w:type="dxa"/>
-              <w:bottom w:w="55" w:type="dxa"/>
-              <w:right w:w="110" w:type="dxa"/>
-            </w:tcMar>
-            <w:vAlign w:val="center"/>
-          </w:tcPr>
-          <w:p>
-            <w:pPr>
-              <w:spacing w:before="40" w:after="40" w:line="240" w:lineRule="auto"/>
-              <w:jc w:val="left"/>
-            </w:pPr>
-            <w:r>
-              <w:rPr>
-                <w:b/>
-                <w:bCs/>
-                <w:sz w:val="18"/>
-                <w:szCs w:val="18"/>
-                <w:color w:val="202020"/>
-              </w:rPr>
-              <w:t xml:space="preserve">EventoTecnicoIngesta</w:t>
-            </w:r>
-          </w:p>
-        </w:tc>
-        <w:tc>
-          <w:tcPr>
-            <w:tcW w:w="2650" w:type="dxa"/>
-            <w:tcBorders>
-              <w:top w:val="single" w:sz="1" w:space="0" w:color="CCCCCC"/>
-              <w:left w:val="single" w:sz="1" w:space="0" w:color="CCCCCC"/>
-              <w:bottom w:val="single" w:sz="1" w:space="0" w:color="CCCCCC"/>
-              <w:right w:val="single" w:sz="1" w:space="0" w:color="CCCCCC"/>
-            </w:tcBorders>
-            <w:tcMar>
-              <w:top w:w="55" w:type="dxa"/>
-              <w:left w:w="110" w:type="dxa"/>
-              <w:bottom w:w="55" w:type="dxa"/>
-              <w:right w:w="110" w:type="dxa"/>
-            </w:tcMar>
-            <w:vAlign w:val="center"/>
-          </w:tcPr>
-          <w:p>
-            <w:pPr>
-              <w:spacing w:before="40" w:after="40" w:line="240" w:lineRule="auto"/>
-              <w:jc w:val="left"/>
-            </w:pPr>
-            <w:r>
-              <w:rPr>
-                <w:rFonts w:ascii="Consolas" w:eastAsia="Consolas" w:hAnsi="Consolas" w:cs="Consolas"/>
-                <w:sz w:val="18"/>
-                <w:szCs w:val="18"/>
-                <w:color w:val="202020"/>
-              </w:rPr>
-              <w:t xml:space="preserve">evento_tecnico_ingesta</w:t>
-            </w:r>
-          </w:p>
-        </w:tc>
-        <w:tc>
-          <w:tcPr>
-            <w:tcW w:w="4060" w:type="dxa"/>
-            <w:tcBorders>
-              <w:top w:val="single" w:sz="1" w:space="0" w:color="CCCCCC"/>
-              <w:left w:val="single" w:sz="1" w:space="0" w:color="CCCCCC"/>
-              <w:bottom w:val="single" w:sz="1" w:space="0" w:color="CCCCCC"/>
-              <w:right w:val="single" w:sz="1" w:space="0" w:color="CCCCCC"/>
-            </w:tcBorders>
-            <w:tcMar>
-              <w:top w:w="55" w:type="dxa"/>
-              <w:left w:w="110" w:type="dxa"/>
-              <w:bottom w:w="55" w:type="dxa"/>
-              <w:right w:w="110" w:type="dxa"/>
-            </w:tcMar>
-            <w:vAlign w:val="center"/>
-          </w:tcPr>
-          <w:p>
-            <w:pPr>
-              <w:spacing w:before="40" w:after="40" w:line="240" w:lineRule="auto"/>
-              <w:jc w:val="left"/>
-            </w:pPr>
-            <w:r>
-              <w:rPr>
-                <w:sz w:val="18"/>
-                <w:szCs w:val="18"/>
-                <w:color w:val="202020"/>
-              </w:rPr>
-              <w:t xml:space="preserve">Clase inmutable (solo inserción). No referencia sensor_id por clave foránea de forma deliberada: guarda sensor_codigo para poder registrar mensajes de sensores aún no registrados.</w:t>
+              <w:t>id; origen; correlación; fecha; causa</w:t>
             </w:r>
           </w:p>
         </w:tc>
@@ -5833,7 +4247,7 @@
                 <w:szCs w:val="18"/>
                 <w:color w:val="202020"/>
               </w:rPr>
-              <w:t>Motor y clúster</w:t>
+              <w:t>Motor</w:t>
             </w:r>
           </w:p>
         </w:tc>
@@ -5867,24 +4281,7 @@
                 <w:szCs w:val="18"/>
                 <w:color w:val="202020"/>
               </w:rPr>
-              <w:t xml:space="preserve">✔ </w:t>
-            </w:r>
-            <w:r>
-              <w:rPr>
-                <w:rFonts w:ascii="Consolas" w:eastAsia="Consolas" w:hAnsi="Consolas" w:cs="Consolas"/>
-                <w:sz w:val="18"/>
-                <w:szCs w:val="18"/>
-                <w:color w:val="202020"/>
-              </w:rPr>
-              <w:t>InnoDB</w:t>
-            </w:r>
-            <w:r>
-              <w:rPr>
-                <w:sz w:val="18"/>
-                <w:szCs w:val="18"/>
-                <w:color w:val="202020"/>
-              </w:rPr>
-              <w:t xml:space="preserve"> en todas las tablas; toda tabla con PK explícita (requisito de Group Replication).</w:t>
+              <w:t>Objetivo: InnoDB; tres nodos, Router y escritor único.</w:t>
             </w:r>
           </w:p>
         </w:tc>
@@ -5911,7 +4308,6 @@
               <w:bottom w:w="55" w:type="dxa"/>
               <w:right w:w="110" w:type="dxa"/>
             </w:tcMar>
-            <w:shd w:val="clear" w:color="auto" w:fill="F7F9FC"/>
             <w:vAlign w:val="center"/>
           </w:tcPr>
           <w:p>
@@ -5946,7 +4342,6 @@
               <w:bottom w:w="55" w:type="dxa"/>
               <w:right w:w="110" w:type="dxa"/>
             </w:tcMar>
-            <w:shd w:val="clear" w:color="auto" w:fill="F7F9FC"/>
             <w:vAlign w:val="center"/>
           </w:tcPr>
           <w:p>
@@ -5962,24 +4357,7 @@
                 <w:szCs w:val="18"/>
                 <w:color w:val="202020"/>
               </w:rPr>
-              <w:t xml:space="preserve">✔ </w:t>
-            </w:r>
-            <w:r>
-              <w:rPr>
-                <w:rFonts w:ascii="Consolas" w:eastAsia="Consolas" w:hAnsi="Consolas" w:cs="Consolas"/>
-                <w:sz w:val="18"/>
-                <w:szCs w:val="18"/>
-                <w:color w:val="202020"/>
-              </w:rPr>
-              <w:t>BIGINT UNSIGNED AUTO_INCREMENT</w:t>
-            </w:r>
-            <w:r>
-              <w:rPr>
-                <w:sz w:val="18"/>
-                <w:szCs w:val="18"/>
-                <w:color w:val="202020"/>
-              </w:rPr>
-              <w:t xml:space="preserve"> como PK en todas las clases.</w:t>
+              <w:t>PK explícitas y claves externas únicas.</w:t>
             </w:r>
           </w:p>
         </w:tc>
@@ -6021,7 +4399,7 @@
                 <w:szCs w:val="18"/>
                 <w:color w:val="202020"/>
               </w:rPr>
-              <w:t>Estados y categorías</w:t>
+              <w:t>Estados</w:t>
             </w:r>
           </w:p>
         </w:tc>
@@ -6055,24 +4433,7 @@
                 <w:szCs w:val="18"/>
                 <w:color w:val="202020"/>
               </w:rPr>
-              <w:t xml:space="preserve">✔ </w:t>
-            </w:r>
-            <w:r>
-              <w:rPr>
-                <w:rFonts w:ascii="Consolas" w:eastAsia="Consolas" w:hAnsi="Consolas" w:cs="Consolas"/>
-                <w:sz w:val="18"/>
-                <w:szCs w:val="18"/>
-                <w:color w:val="202020"/>
-              </w:rPr>
-              <w:t>ENUM</w:t>
-            </w:r>
-            <w:r>
-              <w:rPr>
-                <w:sz w:val="18"/>
-                <w:szCs w:val="18"/>
-                <w:color w:val="202020"/>
-              </w:rPr>
-              <w:t xml:space="preserve"> para rol, estado, criticidad, severidad, origen, resultado, decisión, etc.</w:t>
+              <w:t>Catálogos controlados y transiciones validadas por API.</w:t>
             </w:r>
           </w:p>
         </w:tc>
@@ -6099,7 +4460,6 @@
               <w:bottom w:w="55" w:type="dxa"/>
               <w:right w:w="110" w:type="dxa"/>
             </w:tcMar>
-            <w:shd w:val="clear" w:color="auto" w:fill="F7F9FC"/>
             <w:vAlign w:val="center"/>
           </w:tcPr>
           <w:p>
@@ -6115,7 +4475,7 @@
                 <w:szCs w:val="18"/>
                 <w:color w:val="202020"/>
               </w:rPr>
-              <w:t>Fechas y horas (UTC)</w:t>
+              <w:t>Fechas</w:t>
             </w:r>
           </w:p>
         </w:tc>
@@ -6134,7 +4494,6 @@
               <w:bottom w:w="55" w:type="dxa"/>
               <w:right w:w="110" w:type="dxa"/>
             </w:tcMar>
-            <w:shd w:val="clear" w:color="auto" w:fill="F7F9FC"/>
             <w:vAlign w:val="center"/>
           </w:tcPr>
           <w:p>
@@ -6150,41 +4509,7 @@
                 <w:szCs w:val="18"/>
                 <w:color w:val="202020"/>
               </w:rPr>
-              <w:t xml:space="preserve">✔ </w:t>
-            </w:r>
-            <w:r>
-              <w:rPr>
-                <w:rFonts w:ascii="Consolas" w:eastAsia="Consolas" w:hAnsi="Consolas" w:cs="Consolas"/>
-                <w:sz w:val="18"/>
-                <w:szCs w:val="18"/>
-                <w:color w:val="202020"/>
-              </w:rPr>
-              <w:t>DATETIME</w:t>
-            </w:r>
-            <w:r>
-              <w:rPr>
-                <w:sz w:val="18"/>
-                <w:szCs w:val="18"/>
-                <w:color w:val="202020"/>
-              </w:rPr>
-              <w:t xml:space="preserve"> en UTC (RNF-INT-02); no se usa </w:t>
-            </w:r>
-            <w:r>
-              <w:rPr>
-                <w:rFonts w:ascii="Consolas" w:eastAsia="Consolas" w:hAnsi="Consolas" w:cs="Consolas"/>
-                <w:sz w:val="18"/>
-                <w:szCs w:val="18"/>
-                <w:color w:val="202020"/>
-              </w:rPr>
-              <w:t>TIMESTAMP</w:t>
-            </w:r>
-            <w:r>
-              <w:rPr>
-                <w:sz w:val="18"/>
-                <w:szCs w:val="18"/>
-                <w:color w:val="202020"/>
-              </w:rPr>
-              <w:t>.</w:t>
+              <w:t>Origen y recepción UTC separados.</w:t>
             </w:r>
           </w:p>
         </w:tc>
@@ -6254,11 +4579,13 @@
             </w:pPr>
             <w:r>
               <w:rPr>
-                <w:sz w:val="18"/>
-                <w:szCs w:val="18"/>
-                <w:color w:val="202020"/>
-              </w:rPr>
-              <w:t>✔ UNIQUE en usuario.correo, activo.codigo, activo.numero_serie, sensor.codigo, persona_autorizada.identificador_biometrico_externo y host_problema_zabbix.identificador_externo.</w:t>
+                <w:b/>
+                <w:bCs/>
+                <w:sz w:val="18"/>
+                <w:szCs w:val="18"/>
+                <w:color w:val="202020"/>
+              </w:rPr>
+              <w:t>Idempotencia de dispositivos, Forms, calendario y Zabbix.</w:t>
             </w:r>
           </w:p>
         </w:tc>
@@ -6285,7 +4612,6 @@
               <w:bottom w:w="55" w:type="dxa"/>
               <w:right w:w="110" w:type="dxa"/>
             </w:tcMar>
-            <w:shd w:val="clear" w:color="auto" w:fill="F7F9FC"/>
             <w:vAlign w:val="center"/>
           </w:tcPr>
           <w:p>
@@ -6301,7 +4627,7 @@
                 <w:szCs w:val="18"/>
                 <w:color w:val="202020"/>
               </w:rPr>
-              <w:t>Integridad referencial</w:t>
+              <w:t>Integridad</w:t>
             </w:r>
           </w:p>
         </w:tc>
@@ -6320,21 +4646,22 @@
               <w:bottom w:w="55" w:type="dxa"/>
               <w:right w:w="110" w:type="dxa"/>
             </w:tcMar>
-            <w:shd w:val="clear" w:color="auto" w:fill="F7F9FC"/>
-            <w:vAlign w:val="center"/>
-          </w:tcPr>
-          <w:p>
-            <w:pPr>
-              <w:spacing w:before="40" w:after="40" w:line="240" w:lineRule="auto"/>
-              <w:jc w:val="left"/>
-            </w:pPr>
-            <w:r>
-              <w:rPr>
-                <w:sz w:val="18"/>
-                <w:szCs w:val="18"/>
-                <w:color w:val="202020"/>
-              </w:rPr>
-              <w:t>✔ FK con RESTRICT por defecto; CASCADE en permiso_dia; SET NULL en asociaciones opcionales.</w:t>
+            <w:vAlign w:val="center"/>
+          </w:tcPr>
+          <w:p>
+            <w:pPr>
+              <w:spacing w:before="40" w:after="40" w:line="240" w:lineRule="auto"/>
+              <w:jc w:val="left"/>
+            </w:pPr>
+            <w:r>
+              <w:rPr>
+                <w:b/>
+                <w:bCs/>
+                <w:sz w:val="18"/>
+                <w:szCs w:val="18"/>
+                <w:color w:val="202020"/>
+              </w:rPr>
+              <w:t>FK y retiro lógico; conservar historial.</w:t>
             </w:r>
           </w:p>
         </w:tc>
@@ -6404,11 +4731,13 @@
             </w:pPr>
             <w:r>
               <w:rPr>
-                <w:sz w:val="18"/>
-                <w:szCs w:val="18"/>
-                <w:color w:val="202020"/>
-              </w:rPr>
-              <w:t>✔ medicion, evento_acceso, historial_activo y evento_tecnico_ingesta tratadas como append-only (restricción por permisos en la capa de datos).</w:t>
+                <w:b/>
+                <w:bCs/>
+                <w:sz w:val="18"/>
+                <w:szCs w:val="18"/>
+                <w:color w:val="202020"/>
+              </w:rPr>
+              <w:t>Restringir cambios en tablas de eventos e historial.</w:t>
             </w:r>
           </w:p>
         </w:tc>
@@ -6435,7 +4764,6 @@
               <w:bottom w:w="55" w:type="dxa"/>
               <w:right w:w="110" w:type="dxa"/>
             </w:tcMar>
-            <w:shd w:val="clear" w:color="auto" w:fill="F7F9FC"/>
             <w:vAlign w:val="center"/>
           </w:tcPr>
           <w:p>
@@ -6451,7 +4779,7 @@
                 <w:szCs w:val="18"/>
                 <w:color w:val="202020"/>
               </w:rPr>
-              <w:t>Nomenclatura y charset</w:t>
+              <w:t>Validación</w:t>
             </w:r>
           </w:p>
         </w:tc>
@@ -6470,89 +4798,22 @@
               <w:bottom w:w="55" w:type="dxa"/>
               <w:right w:w="110" w:type="dxa"/>
             </w:tcMar>
-            <w:shd w:val="clear" w:color="auto" w:fill="F7F9FC"/>
-            <w:vAlign w:val="center"/>
-          </w:tcPr>
-          <w:p>
-            <w:pPr>
-              <w:spacing w:before="40" w:after="40" w:line="240" w:lineRule="auto"/>
-              <w:jc w:val="left"/>
-            </w:pPr>
-            <w:r>
-              <w:rPr>
-                <w:sz w:val="18"/>
-                <w:szCs w:val="18"/>
-                <w:color w:val="202020"/>
-              </w:rPr>
-              <w:t xml:space="preserve">✔ snake_case, prefijos </w:t>
-            </w:r>
-            <w:r>
-              <w:rPr>
-                <w:rFonts w:ascii="Consolas" w:eastAsia="Consolas" w:hAnsi="Consolas" w:cs="Consolas"/>
-                <w:sz w:val="18"/>
-                <w:szCs w:val="18"/>
-                <w:color w:val="202020"/>
-              </w:rPr>
-              <w:t>fk_</w:t>
-            </w:r>
-            <w:r>
-              <w:rPr>
-                <w:sz w:val="18"/>
-                <w:szCs w:val="18"/>
-                <w:color w:val="202020"/>
-              </w:rPr>
-              <w:t>/</w:t>
-            </w:r>
-            <w:r>
-              <w:rPr>
-                <w:rFonts w:ascii="Consolas" w:eastAsia="Consolas" w:hAnsi="Consolas" w:cs="Consolas"/>
-                <w:sz w:val="18"/>
-                <w:szCs w:val="18"/>
-                <w:color w:val="202020"/>
-              </w:rPr>
-              <w:t>idx_</w:t>
-            </w:r>
-            <w:r>
-              <w:rPr>
-                <w:sz w:val="18"/>
-                <w:szCs w:val="18"/>
-                <w:color w:val="202020"/>
-              </w:rPr>
-              <w:t>/</w:t>
-            </w:r>
-            <w:r>
-              <w:rPr>
-                <w:rFonts w:ascii="Consolas" w:eastAsia="Consolas" w:hAnsi="Consolas" w:cs="Consolas"/>
-                <w:sz w:val="18"/>
-                <w:szCs w:val="18"/>
-                <w:color w:val="202020"/>
-              </w:rPr>
-              <w:t>uq_</w:t>
-            </w:r>
-            <w:r>
-              <w:rPr>
-                <w:sz w:val="18"/>
-                <w:szCs w:val="18"/>
-                <w:color w:val="202020"/>
-              </w:rPr>
-              <w:t xml:space="preserve">; </w:t>
-            </w:r>
-            <w:r>
-              <w:rPr>
-                <w:rFonts w:ascii="Consolas" w:eastAsia="Consolas" w:hAnsi="Consolas" w:cs="Consolas"/>
-                <w:sz w:val="18"/>
-                <w:szCs w:val="18"/>
-                <w:color w:val="202020"/>
-              </w:rPr>
-              <w:t>utf8mb4</w:t>
-            </w:r>
-            <w:r>
-              <w:rPr>
-                <w:sz w:val="18"/>
-                <w:szCs w:val="18"/>
-                <w:color w:val="202020"/>
-              </w:rPr>
-              <w:t xml:space="preserve"> en todas las tablas.</w:t>
+            <w:vAlign w:val="center"/>
+          </w:tcPr>
+          <w:p>
+            <w:pPr>
+              <w:spacing w:before="40" w:after="40" w:line="240" w:lineRule="auto"/>
+              <w:jc w:val="left"/>
+            </w:pPr>
+            <w:r>
+              <w:rPr>
+                <w:b/>
+                <w:bCs/>
+                <w:sz w:val="18"/>
+                <w:szCs w:val="18"/>
+                <w:color w:val="202020"/>
+              </w:rPr>
+              <w:t>Migraciones y pruebas pendientes en #9; no afirmar ejecución.</w:t>
             </w:r>
           </w:p>
         </w:tc>
@@ -6589,10 +4850,7 @@
           <w:b/>
           <w:bCs/>
         </w:rPr>
-        <w:t xml:space="preserve">Medicion: </w:t>
-      </w:r>
-      <w:r>
-        <w:t>el modelo físico agrega evento_id (idempotencia de ingesta) y distingue fecha_hora_medicion de fecha_hora_recepcion; el diagrama las abstrae en fecha_hora.</w:t>
+        <w:t>Medicion conserva identificador idempotente, fecha del dispositivo, recepción UTC y origen real/simulado.</w:t>
       </w:r>
     </w:p>
     <w:p>
@@ -6609,10 +4867,7 @@
           <w:b/>
           <w:bCs/>
         </w:rPr>
-        <w:t xml:space="preserve">Sensor: </w:t>
-      </w:r>
-      <w:r>
-        <w:t>el modelo físico agrega device_key_hash para autenticar la ingesta del dispositivo.</w:t>
+        <w:t>Sensor conserva credencial protegida; los secretos externos no se publican.</w:t>
       </w:r>
     </w:p>
     <w:p>
@@ -6629,10 +4884,7 @@
           <w:b/>
           <w:bCs/>
         </w:rPr>
-        <w:t xml:space="preserve">ReglaAlerta.destinatarios: </w:t>
-      </w:r>
-      <w:r>
-        <w:t>se representa como lista en UML y se materializa como JSON (o tabla normalizada, a decidir) en el modelo físico.</w:t>
+        <w:t>UmbralAmbiental identifica zona o dispositivo; definir precedencia antes de admitir configuraciones simultáneas.</w:t>
       </w:r>
     </w:p>
     <w:p>
@@ -6649,10 +4901,7 @@
           <w:b/>
           <w:bCs/>
         </w:rPr>
-        <w:t xml:space="preserve">Particionamiento de medicion: </w:t>
-      </w:r>
-      <w:r>
-        <w:t>por volumen (hasta 43.200 registros/sensor/día) el modelo físico contempla particionamiento por rango de fecha; es una decisión de implementación que no afecta el diagrama de clases.</w:t>
+        <w:t>El volumen depende del intervalo acordado y de las pruebas. No se exige particionamiento por una frecuencia no confirmada.</w:t>
       </w:r>
     </w:p>
     <w:p>
@@ -6669,7 +4918,7 @@
         <w:jc w:val="both"/>
       </w:pPr>
       <w:r>
-        <w:t>Equipo SICMA. (2026). Documento de requerimientos v1.2; Documento de casos de uso; Documento de diagrama de clases; Documento de diagramas de actividad [Documentos académicos internos].</w:t>
+        <w:t>Equipo SICMA. (2026). Instrucciones; RHU, casos y modelo de datos revisados el 5 de octubre de 2026.</w:t>
       </w:r>
     </w:p>
     <w:p>
@@ -6705,7 +4954,7 @@
           <w:sz w:val="20"/>
           <w:szCs w:val="20"/>
         </w:rPr>
-        <w:t>Modelo de datos de SICMA. Cajas de tres secciones, PK subrayada, «FK»/«U» como marcadores, multiplicidades en ambos extremos y composición (rombo) en PermisoAcceso ◆— PermisoDia.</w:t>
+        <w:t>Modelo conceptual vigente. Las relaciones se detallan en la sección 3; los atributos físicos completos y migraciones se validan en #9.</w:t>
       </w:r>
     </w:p>
     <w:p>
@@ -6718,7 +4967,7 @@
         </w:rPr>
         <w:drawing>
           <wp:inline distT="0" distB="0" distL="0" distR="0" wp14:anchorId="6F68FDC7" wp14:editId="07777777">
-            <wp:extent cx="9182100" cy="3971925"/>
+            <wp:extent cx="5852160" cy="4242816"/>
             <wp:effectExtent l="0" t="0" r="0" b="0"/>
             <wp:docPr id="1" name="SICMA UML" descr="Diagrama UML del modelo de datos" title="Diagrama de clases SICMA"/>
             <wp:cNvGraphicFramePr>
@@ -6743,7 +4992,7 @@
                   <pic:spPr bwMode="auto">
                     <a:xfrm>
                       <a:off x="0" y="0"/>
-                      <a:ext cx="9182100" cy="3971925"/>
+                      <a:ext cx="5852160" cy="4242816"/>
                     </a:xfrm>
                     <a:prstGeom prst="rect">
                       <a:avLst/>

</xml_diff>